<commit_message>
docs: update course design report
</commit_message>
<xml_diff>
--- a/课程设计报告.docx
+++ b/课程设计报告.docx
@@ -6,8 +6,6 @@
       <w:pPr>
         <w:spacing w:after="2400"/>
       </w:pPr>
-      <w:bookmarkStart w:id="0" w:name="_GoBack"/>
-      <w:bookmarkEnd w:id="0"/>
     </w:p>
     <w:p>
       <w:pPr>
@@ -48,14 +46,36 @@
       <w:pPr>
         <w:spacing w:after="1200"/>
         <w:jc w:val="center"/>
-      </w:pPr>
-      <w:r>
         <w:rPr>
           <w:sz w:val="24"/>
           <w:szCs w:val="24"/>
         </w:rPr>
+      </w:pPr>
+      <w:r>
+        <w:rPr>
+          <w:sz w:val="24"/>
+          <w:szCs w:val="24"/>
+        </w:rPr>
         <w:t>基于 Python 的跨平台 TCP 端口扫描与 ICMP 主机发现工具</w:t>
       </w:r>
+    </w:p>
+    <w:p>
+      <w:pPr>
+        <w:spacing w:after="1200"/>
+        <w:jc w:val="center"/>
+      </w:pPr>
+      <w:r>
+        <w:rPr>
+          <w:sz w:val="24"/>
+          <w:szCs w:val="24"/>
+        </w:rPr>
+        <w:t>含双界面（CLI + GUI）与自动报告生成</w:t>
+      </w:r>
+    </w:p>
+    <w:p>
+      <w:pPr>
+        <w:spacing w:after="1200"/>
+      </w:pPr>
     </w:p>
     <w:p>
       <w:pPr>
@@ -67,13 +87,17 @@
           <w:sz w:val="24"/>
           <w:szCs w:val="24"/>
         </w:rPr>
-        <w:t>含双界面（CLI + GUI）与自动报告生成</w:t>
-      </w:r>
-    </w:p>
-    <w:p>
-      <w:pPr>
-        <w:spacing w:after="1200"/>
-      </w:pPr>
+        <w:t>学院：_</w:t>
+      </w:r>
+      <w:bookmarkStart w:id="31" w:name="_GoBack"/>
+      <w:bookmarkEnd w:id="31"/>
+      <w:r>
+        <w:rPr>
+          <w:sz w:val="24"/>
+          <w:szCs w:val="24"/>
+        </w:rPr>
+        <w:t>_________  班级：__________</w:t>
+      </w:r>
     </w:p>
     <w:p>
       <w:pPr>
@@ -85,12 +109,12 @@
           <w:sz w:val="24"/>
           <w:szCs w:val="24"/>
         </w:rPr>
-        <w:t>学院：__________  班级：__________</w:t>
-      </w:r>
-    </w:p>
-    <w:p>
-      <w:pPr>
-        <w:spacing w:after="300"/>
+        <w:t>姓名：__________  学号：__________</w:t>
+      </w:r>
+    </w:p>
+    <w:p>
+      <w:pPr>
+        <w:spacing w:after="600"/>
         <w:jc w:val="center"/>
       </w:pPr>
       <w:r>
@@ -98,21 +122,553 @@
           <w:sz w:val="24"/>
           <w:szCs w:val="24"/>
         </w:rPr>
-        <w:t>姓名：__________  学号：__________</w:t>
-      </w:r>
-    </w:p>
-    <w:p>
-      <w:pPr>
-        <w:spacing w:after="600"/>
+        <w:t>2026 年 5 月</w:t>
+      </w:r>
+    </w:p>
+    <w:p/>
+    <w:p/>
+    <w:p/>
+    <w:p/>
+    <w:p>
+      <w:pPr>
         <w:jc w:val="center"/>
-      </w:pPr>
-      <w:r>
-        <w:rPr>
-          <w:sz w:val="24"/>
-          <w:szCs w:val="24"/>
-        </w:rPr>
-        <w:t>2026 年 5 月</w:t>
-      </w:r>
+        <w:rPr>
+          <w:rFonts w:hint="default" w:ascii="Times New Roman" w:hAnsi="Times New Roman" w:eastAsia="宋体" w:cs="Times New Roman"/>
+          <w:b/>
+          <w:bCs/>
+          <w:sz w:val="36"/>
+          <w:lang w:val="en-US" w:eastAsia="zh-CN"/>
+        </w:rPr>
+      </w:pPr>
+      <w:r>
+        <w:rPr>
+          <w:rFonts w:hint="default" w:ascii="Times New Roman" w:hAnsi="Times New Roman" w:cs="Times New Roman"/>
+          <w:b/>
+          <w:bCs/>
+          <w:sz w:val="36"/>
+        </w:rPr>
+        <w:t>设计题目</w:t>
+      </w:r>
+      <w:r>
+        <w:rPr>
+          <w:rFonts w:hint="default" w:ascii="Times New Roman" w:hAnsi="Times New Roman" w:cs="Times New Roman"/>
+          <w:b/>
+          <w:bCs/>
+          <w:sz w:val="36"/>
+          <w:lang w:val="en-US" w:eastAsia="zh-CN"/>
+        </w:rPr>
+        <w:t>四</w:t>
+      </w:r>
+      <w:r>
+        <w:rPr>
+          <w:rFonts w:hint="default" w:ascii="Times New Roman" w:hAnsi="Times New Roman" w:cs="Times New Roman"/>
+          <w:b/>
+          <w:bCs/>
+          <w:sz w:val="36"/>
+        </w:rPr>
+        <w:t xml:space="preserve">     </w:t>
+      </w:r>
+      <w:r>
+        <w:rPr>
+          <w:rFonts w:hint="default" w:ascii="Times New Roman" w:hAnsi="Times New Roman" w:cs="Times New Roman"/>
+          <w:b/>
+          <w:bCs/>
+          <w:sz w:val="36"/>
+          <w:lang w:val="en-US" w:eastAsia="zh-CN"/>
+        </w:rPr>
+        <w:t>端口扫描</w:t>
+      </w:r>
+    </w:p>
+    <w:p>
+      <w:pPr>
+        <w:jc w:val="both"/>
+        <w:rPr>
+          <w:rFonts w:hint="default" w:ascii="Times New Roman" w:hAnsi="Times New Roman" w:cs="Times New Roman"/>
+          <w:b/>
+          <w:bCs/>
+          <w:sz w:val="36"/>
+        </w:rPr>
+      </w:pPr>
+    </w:p>
+    <w:p>
+      <w:pPr>
+        <w:rPr>
+          <w:rFonts w:hint="default" w:ascii="Times New Roman" w:hAnsi="Times New Roman" w:cs="Times New Roman"/>
+        </w:rPr>
+      </w:pPr>
+      <w:r>
+        <w:rPr>
+          <w:rFonts w:hint="default" w:ascii="Times New Roman" w:hAnsi="Times New Roman" w:cs="Times New Roman"/>
+        </w:rPr>
+        <w:t>【</w:t>
+      </w:r>
+      <w:r>
+        <w:rPr>
+          <w:rFonts w:hint="default" w:ascii="Times New Roman" w:hAnsi="Times New Roman" w:cs="Times New Roman"/>
+          <w:b/>
+          <w:bCs/>
+        </w:rPr>
+        <w:t>设计目的</w:t>
+      </w:r>
+      <w:r>
+        <w:rPr>
+          <w:rFonts w:hint="default" w:ascii="Times New Roman" w:hAnsi="Times New Roman" w:cs="Times New Roman"/>
+        </w:rPr>
+        <w:t xml:space="preserve">】 </w:t>
+      </w:r>
+    </w:p>
+    <w:p>
+      <w:pPr>
+        <w:ind w:firstLine="420" w:firstLineChars="200"/>
+        <w:rPr>
+          <w:rFonts w:hint="default" w:ascii="Times New Roman" w:hAnsi="Times New Roman" w:cs="Times New Roman"/>
+        </w:rPr>
+      </w:pPr>
+      <w:r>
+        <w:rPr>
+          <w:rFonts w:hint="default" w:ascii="Times New Roman" w:hAnsi="Times New Roman" w:cs="Times New Roman"/>
+        </w:rPr>
+        <w:t>1）</w:t>
+      </w:r>
+      <w:r>
+        <w:rPr>
+          <w:rFonts w:hint="default" w:ascii="Times New Roman" w:hAnsi="Times New Roman" w:cs="Times New Roman"/>
+          <w:lang w:val="en-US" w:eastAsia="zh-CN"/>
+        </w:rPr>
+        <w:t>通过文献检索掌握端口扫描的工作原理，工作流程，设计实现方案，并对方案做合理性论证</w:t>
+      </w:r>
+      <w:r>
+        <w:rPr>
+          <w:rFonts w:hint="default" w:ascii="Times New Roman" w:hAnsi="Times New Roman" w:cs="Times New Roman"/>
+        </w:rPr>
+        <w:t xml:space="preserve">。 </w:t>
+      </w:r>
+    </w:p>
+    <w:p>
+      <w:pPr>
+        <w:ind w:firstLine="420" w:firstLineChars="200"/>
+        <w:rPr>
+          <w:rFonts w:hint="default" w:ascii="Times New Roman" w:hAnsi="Times New Roman" w:cs="Times New Roman"/>
+        </w:rPr>
+      </w:pPr>
+      <w:r>
+        <w:rPr>
+          <w:rFonts w:hint="default" w:ascii="Times New Roman" w:hAnsi="Times New Roman" w:cs="Times New Roman"/>
+        </w:rPr>
+        <w:t>2）</w:t>
+      </w:r>
+      <w:r>
+        <w:rPr>
+          <w:rFonts w:hint="default" w:ascii="Times New Roman" w:hAnsi="Times New Roman" w:cs="Times New Roman"/>
+          <w:lang w:val="en-US" w:eastAsia="zh-CN"/>
+        </w:rPr>
+        <w:t>选择合适的开发工具、测试方法，设计实现扫描器</w:t>
+      </w:r>
+      <w:r>
+        <w:rPr>
+          <w:rFonts w:hint="default" w:ascii="Times New Roman" w:hAnsi="Times New Roman" w:cs="Times New Roman"/>
+        </w:rPr>
+        <w:t xml:space="preserve">。 </w:t>
+      </w:r>
+    </w:p>
+    <w:p>
+      <w:pPr>
+        <w:ind w:firstLine="420" w:firstLineChars="200"/>
+        <w:rPr>
+          <w:rFonts w:hint="default" w:ascii="Times New Roman" w:hAnsi="Times New Roman" w:cs="Times New Roman"/>
+        </w:rPr>
+      </w:pPr>
+      <w:r>
+        <w:rPr>
+          <w:rFonts w:hint="default" w:ascii="Times New Roman" w:hAnsi="Times New Roman" w:cs="Times New Roman"/>
+        </w:rPr>
+        <w:t>3）</w:t>
+      </w:r>
+      <w:r>
+        <w:rPr>
+          <w:rFonts w:hint="default" w:ascii="Times New Roman" w:hAnsi="Times New Roman" w:cs="Times New Roman"/>
+          <w:lang w:val="en-US" w:eastAsia="zh-CN"/>
+        </w:rPr>
+        <w:t>整理设计过程中的文档、代码，将设计、测试过程撰写成课程设计报告</w:t>
+      </w:r>
+      <w:r>
+        <w:rPr>
+          <w:rFonts w:hint="default" w:ascii="Times New Roman" w:hAnsi="Times New Roman" w:cs="Times New Roman"/>
+        </w:rPr>
+        <w:t xml:space="preserve">。 </w:t>
+      </w:r>
+    </w:p>
+    <w:p>
+      <w:pPr>
+        <w:ind w:firstLine="420" w:firstLineChars="200"/>
+        <w:rPr>
+          <w:rFonts w:hint="default" w:ascii="Times New Roman" w:hAnsi="Times New Roman" w:cs="Times New Roman"/>
+        </w:rPr>
+      </w:pPr>
+    </w:p>
+    <w:p>
+      <w:pPr>
+        <w:rPr>
+          <w:rFonts w:hint="default" w:ascii="Times New Roman" w:hAnsi="Times New Roman" w:cs="Times New Roman"/>
+        </w:rPr>
+      </w:pPr>
+      <w:r>
+        <w:rPr>
+          <w:rFonts w:hint="default" w:ascii="Times New Roman" w:hAnsi="Times New Roman" w:cs="Times New Roman"/>
+        </w:rPr>
+        <w:t>【</w:t>
+      </w:r>
+      <w:r>
+        <w:rPr>
+          <w:rFonts w:hint="default" w:ascii="Times New Roman" w:hAnsi="Times New Roman" w:cs="Times New Roman"/>
+          <w:b/>
+          <w:bCs/>
+        </w:rPr>
+        <w:t>设计任务</w:t>
+      </w:r>
+      <w:r>
+        <w:rPr>
+          <w:rFonts w:hint="default" w:ascii="Times New Roman" w:hAnsi="Times New Roman" w:cs="Times New Roman"/>
+        </w:rPr>
+        <w:t xml:space="preserve">】 </w:t>
+      </w:r>
+    </w:p>
+    <w:p>
+      <w:pPr>
+        <w:ind w:firstLine="420" w:firstLineChars="200"/>
+        <w:rPr>
+          <w:rFonts w:hint="default" w:ascii="Times New Roman" w:hAnsi="Times New Roman" w:cs="Times New Roman"/>
+        </w:rPr>
+      </w:pPr>
+      <w:r>
+        <w:rPr>
+          <w:rFonts w:hint="default" w:ascii="Times New Roman" w:hAnsi="Times New Roman" w:cs="Times New Roman"/>
+          <w:lang w:val="en-US" w:eastAsia="zh-CN"/>
+        </w:rPr>
+        <w:t>选择合适的IDEA</w:t>
+      </w:r>
+      <w:r>
+        <w:rPr>
+          <w:rFonts w:hint="default" w:ascii="Times New Roman" w:hAnsi="Times New Roman" w:cs="Times New Roman"/>
+        </w:rPr>
+        <w:t>实现</w:t>
+      </w:r>
+      <w:r>
+        <w:rPr>
+          <w:rFonts w:hint="default" w:ascii="Times New Roman" w:hAnsi="Times New Roman" w:cs="Times New Roman"/>
+          <w:lang w:val="en-US" w:eastAsia="zh-CN"/>
+        </w:rPr>
+        <w:t>扫描器</w:t>
+      </w:r>
+      <w:r>
+        <w:rPr>
+          <w:rFonts w:hint="default" w:ascii="Times New Roman" w:hAnsi="Times New Roman" w:cs="Times New Roman"/>
+        </w:rPr>
+        <w:t xml:space="preserve">。 </w:t>
+      </w:r>
+    </w:p>
+    <w:p>
+      <w:pPr>
+        <w:ind w:firstLine="420" w:firstLineChars="200"/>
+        <w:rPr>
+          <w:rFonts w:hint="default" w:ascii="Times New Roman" w:hAnsi="Times New Roman" w:cs="Times New Roman"/>
+        </w:rPr>
+      </w:pPr>
+    </w:p>
+    <w:p>
+      <w:pPr>
+        <w:rPr>
+          <w:rFonts w:hint="default" w:ascii="Times New Roman" w:hAnsi="Times New Roman" w:cs="Times New Roman"/>
+        </w:rPr>
+      </w:pPr>
+      <w:r>
+        <w:rPr>
+          <w:rFonts w:hint="default" w:ascii="Times New Roman" w:hAnsi="Times New Roman" w:cs="Times New Roman"/>
+        </w:rPr>
+        <w:t>【</w:t>
+      </w:r>
+      <w:r>
+        <w:rPr>
+          <w:rFonts w:hint="default" w:ascii="Times New Roman" w:hAnsi="Times New Roman" w:cs="Times New Roman"/>
+          <w:b/>
+          <w:bCs/>
+        </w:rPr>
+        <w:t>设计要求</w:t>
+      </w:r>
+      <w:r>
+        <w:rPr>
+          <w:rFonts w:hint="default" w:ascii="Times New Roman" w:hAnsi="Times New Roman" w:cs="Times New Roman"/>
+        </w:rPr>
+        <w:t xml:space="preserve">】 </w:t>
+      </w:r>
+    </w:p>
+    <w:p>
+      <w:pPr>
+        <w:ind w:firstLine="420" w:firstLineChars="200"/>
+        <w:rPr>
+          <w:rFonts w:hint="default" w:ascii="Times New Roman" w:hAnsi="Times New Roman" w:eastAsia="宋体" w:cs="Times New Roman"/>
+          <w:lang w:eastAsia="zh-CN"/>
+        </w:rPr>
+      </w:pPr>
+      <w:r>
+        <w:rPr>
+          <w:rFonts w:hint="default" w:ascii="Times New Roman" w:hAnsi="Times New Roman" w:cs="Times New Roman"/>
+        </w:rPr>
+        <w:t>1）</w:t>
+      </w:r>
+      <w:r>
+        <w:rPr>
+          <w:rFonts w:hint="default" w:ascii="Times New Roman" w:hAnsi="Times New Roman" w:cs="Times New Roman"/>
+          <w:lang w:val="en-US" w:eastAsia="zh-CN"/>
+        </w:rPr>
+        <w:t>利用Socket编程实现对一个网段的扫描</w:t>
+      </w:r>
+      <w:r>
+        <w:rPr>
+          <w:rFonts w:hint="default" w:ascii="Times New Roman" w:hAnsi="Times New Roman" w:cs="Times New Roman"/>
+          <w:lang w:eastAsia="zh-CN"/>
+        </w:rPr>
+        <w:t>；</w:t>
+      </w:r>
+    </w:p>
+    <w:p>
+      <w:pPr>
+        <w:ind w:firstLine="420" w:firstLineChars="200"/>
+        <w:rPr>
+          <w:rFonts w:hint="default" w:ascii="Times New Roman" w:hAnsi="Times New Roman" w:cs="Times New Roman"/>
+          <w:lang w:eastAsia="zh-CN"/>
+        </w:rPr>
+      </w:pPr>
+      <w:r>
+        <w:rPr>
+          <w:rFonts w:hint="default" w:ascii="Times New Roman" w:hAnsi="Times New Roman" w:cs="Times New Roman"/>
+        </w:rPr>
+        <w:t>2）</w:t>
+      </w:r>
+      <w:r>
+        <w:rPr>
+          <w:rFonts w:hint="default" w:ascii="Times New Roman" w:hAnsi="Times New Roman" w:cs="Times New Roman"/>
+          <w:lang w:val="en-US" w:eastAsia="zh-CN"/>
+        </w:rPr>
+        <w:t>不限定操作系统平台（</w:t>
+      </w:r>
+      <w:r>
+        <w:rPr>
+          <w:rFonts w:hint="default" w:ascii="Times New Roman" w:hAnsi="Times New Roman" w:cs="Times New Roman"/>
+        </w:rPr>
+        <w:t>Windows 或 Linux 环境</w:t>
+      </w:r>
+      <w:r>
+        <w:rPr>
+          <w:rFonts w:hint="default" w:ascii="Times New Roman" w:hAnsi="Times New Roman" w:cs="Times New Roman"/>
+          <w:lang w:val="en-US" w:eastAsia="zh-CN"/>
+        </w:rPr>
+        <w:t>），在局域网内完成对主机的端口扫描</w:t>
+      </w:r>
+      <w:r>
+        <w:rPr>
+          <w:rFonts w:hint="default" w:ascii="Times New Roman" w:hAnsi="Times New Roman" w:cs="Times New Roman"/>
+          <w:lang w:eastAsia="zh-CN"/>
+        </w:rPr>
+        <w:t>；</w:t>
+      </w:r>
+    </w:p>
+    <w:p>
+      <w:pPr>
+        <w:ind w:firstLine="420" w:firstLineChars="200"/>
+        <w:rPr>
+          <w:rFonts w:hint="default" w:ascii="Times New Roman" w:hAnsi="Times New Roman" w:cs="Times New Roman"/>
+          <w:lang w:eastAsia="zh-CN"/>
+        </w:rPr>
+      </w:pPr>
+      <w:r>
+        <w:rPr>
+          <w:rFonts w:hint="default" w:ascii="Times New Roman" w:hAnsi="Times New Roman" w:cs="Times New Roman"/>
+          <w:lang w:val="en-US" w:eastAsia="zh-CN"/>
+        </w:rPr>
+        <w:t>3）</w:t>
+      </w:r>
+      <w:r>
+        <w:rPr>
+          <w:rFonts w:hint="default" w:ascii="Times New Roman" w:hAnsi="Times New Roman" w:cs="Times New Roman"/>
+        </w:rPr>
+        <w:t>使用 TCP connect 、 TCP SYN 和 TCP FIN</w:t>
+      </w:r>
+      <w:r>
+        <w:rPr>
+          <w:rFonts w:hint="default" w:ascii="Times New Roman" w:hAnsi="Times New Roman" w:cs="Times New Roman"/>
+          <w:lang w:val="en-US" w:eastAsia="zh-CN"/>
+        </w:rPr>
+        <w:t>选择其一</w:t>
+      </w:r>
+      <w:r>
+        <w:rPr>
+          <w:rFonts w:hint="default" w:ascii="Times New Roman" w:hAnsi="Times New Roman" w:cs="Times New Roman"/>
+        </w:rPr>
+        <w:t>进行端口扫描，使用 ICMP echo 扫描实现 IP 扫描</w:t>
+      </w:r>
+      <w:r>
+        <w:rPr>
+          <w:rFonts w:hint="default" w:ascii="Times New Roman" w:hAnsi="Times New Roman" w:cs="Times New Roman"/>
+          <w:lang w:eastAsia="zh-CN"/>
+        </w:rPr>
+        <w:t>；</w:t>
+      </w:r>
+    </w:p>
+    <w:p>
+      <w:pPr>
+        <w:ind w:firstLine="420" w:firstLineChars="200"/>
+        <w:rPr>
+          <w:rFonts w:hint="default" w:ascii="Times New Roman" w:hAnsi="Times New Roman" w:cs="Times New Roman"/>
+          <w:lang w:val="en-US" w:eastAsia="zh-CN"/>
+        </w:rPr>
+      </w:pPr>
+      <w:r>
+        <w:rPr>
+          <w:rFonts w:hint="default" w:ascii="Times New Roman" w:hAnsi="Times New Roman" w:cs="Times New Roman"/>
+          <w:lang w:val="en-US" w:eastAsia="zh-CN"/>
+        </w:rPr>
+        <w:t>4）欢迎扩展</w:t>
+      </w:r>
+      <w:r>
+        <w:rPr>
+          <w:rFonts w:hint="eastAsia" w:cs="Times New Roman"/>
+          <w:lang w:val="en-US" w:eastAsia="zh-CN"/>
+        </w:rPr>
+        <w:t>扫描</w:t>
+      </w:r>
+      <w:r>
+        <w:rPr>
+          <w:rFonts w:hint="default" w:ascii="Times New Roman" w:hAnsi="Times New Roman" w:cs="Times New Roman"/>
+          <w:lang w:val="en-US" w:eastAsia="zh-CN"/>
+        </w:rPr>
+        <w:t>功能包括但不限于</w:t>
+      </w:r>
+      <w:r>
+        <w:rPr>
+          <w:rFonts w:hint="eastAsia" w:cs="Times New Roman"/>
+          <w:lang w:val="en-US" w:eastAsia="zh-CN"/>
+        </w:rPr>
+        <w:t>友好的UI，结果保存</w:t>
+      </w:r>
+      <w:r>
+        <w:rPr>
+          <w:rFonts w:hint="default" w:ascii="Times New Roman" w:hAnsi="Times New Roman" w:cs="Times New Roman"/>
+          <w:lang w:val="en-US" w:eastAsia="zh-CN"/>
+        </w:rPr>
+        <w:t>等。</w:t>
+      </w:r>
+    </w:p>
+    <w:p>
+      <w:pPr>
+        <w:ind w:firstLine="420" w:firstLineChars="200"/>
+        <w:rPr>
+          <w:rFonts w:hint="default" w:ascii="Times New Roman" w:hAnsi="Times New Roman" w:cs="Times New Roman"/>
+        </w:rPr>
+      </w:pPr>
+    </w:p>
+    <w:p>
+      <w:pPr>
+        <w:ind w:firstLine="420" w:firstLineChars="200"/>
+        <w:rPr>
+          <w:rFonts w:hint="default" w:ascii="Times New Roman" w:hAnsi="Times New Roman" w:cs="Times New Roman"/>
+        </w:rPr>
+      </w:pPr>
+    </w:p>
+    <w:p>
+      <w:pPr>
+        <w:rPr>
+          <w:rFonts w:hint="default" w:ascii="Times New Roman" w:hAnsi="Times New Roman" w:cs="Times New Roman"/>
+        </w:rPr>
+      </w:pPr>
+      <w:r>
+        <w:rPr>
+          <w:rFonts w:hint="default" w:ascii="Times New Roman" w:hAnsi="Times New Roman" w:cs="Times New Roman"/>
+        </w:rPr>
+        <w:t>【</w:t>
+      </w:r>
+      <w:r>
+        <w:rPr>
+          <w:rFonts w:hint="default" w:ascii="Times New Roman" w:hAnsi="Times New Roman" w:cs="Times New Roman"/>
+          <w:b/>
+          <w:bCs/>
+        </w:rPr>
+        <w:t>设计提交</w:t>
+      </w:r>
+      <w:r>
+        <w:rPr>
+          <w:rFonts w:hint="default" w:ascii="Times New Roman" w:hAnsi="Times New Roman" w:cs="Times New Roman"/>
+        </w:rPr>
+        <w:t xml:space="preserve">】 </w:t>
+      </w:r>
+    </w:p>
+    <w:p>
+      <w:pPr>
+        <w:rPr>
+          <w:rFonts w:hint="default" w:ascii="Times New Roman" w:hAnsi="Times New Roman" w:cs="Times New Roman"/>
+        </w:rPr>
+      </w:pPr>
+      <w:r>
+        <w:rPr>
+          <w:rFonts w:hint="default" w:ascii="Times New Roman" w:hAnsi="Times New Roman" w:cs="Times New Roman"/>
+        </w:rPr>
+        <w:t>•  所有程序源代码，并可编译执行；</w:t>
+      </w:r>
+    </w:p>
+    <w:p>
+      <w:pPr>
+        <w:rPr>
+          <w:rFonts w:hint="default" w:ascii="Times New Roman" w:hAnsi="Times New Roman" w:cs="Times New Roman"/>
+        </w:rPr>
+      </w:pPr>
+      <w:r>
+        <w:rPr>
+          <w:rFonts w:hint="default" w:ascii="Times New Roman" w:hAnsi="Times New Roman" w:cs="Times New Roman"/>
+        </w:rPr>
+        <w:t xml:space="preserve">•  课程设计报告文档： </w:t>
+      </w:r>
+    </w:p>
+    <w:p>
+      <w:pPr>
+        <w:ind w:firstLine="420" w:firstLineChars="200"/>
+        <w:rPr>
+          <w:rFonts w:hint="default" w:ascii="Times New Roman" w:hAnsi="Times New Roman" w:cs="Times New Roman"/>
+        </w:rPr>
+      </w:pPr>
+      <w:r>
+        <w:rPr>
+          <w:rFonts w:hint="default" w:ascii="Times New Roman" w:hAnsi="Times New Roman" w:cs="Times New Roman"/>
+        </w:rPr>
+        <w:t>文档应包括</w:t>
+      </w:r>
+      <w:r>
+        <w:rPr>
+          <w:rFonts w:hint="default" w:ascii="Times New Roman" w:hAnsi="Times New Roman" w:cs="Times New Roman"/>
+          <w:lang w:val="en-US" w:eastAsia="zh-CN"/>
+        </w:rPr>
+        <w:t>系统需求、概要设计、详细设计、测试</w:t>
+      </w:r>
+      <w:r>
+        <w:rPr>
+          <w:rFonts w:hint="default" w:ascii="Times New Roman" w:hAnsi="Times New Roman" w:cs="Times New Roman"/>
+        </w:rPr>
+        <w:t>，程序详细设计说明及收获部分，其中详细说明应包括程序流程，主要数据结构及主要函数说明。</w:t>
+      </w:r>
+    </w:p>
+    <w:p>
+      <w:pPr>
+        <w:ind w:firstLine="420" w:firstLineChars="200"/>
+        <w:rPr>
+          <w:rFonts w:hint="default" w:ascii="Times New Roman" w:hAnsi="Times New Roman" w:cs="Times New Roman"/>
+        </w:rPr>
+      </w:pPr>
+    </w:p>
+    <w:p>
+      <w:pPr>
+        <w:rPr>
+          <w:rFonts w:hint="default" w:ascii="Times New Roman" w:hAnsi="Times New Roman" w:cs="Times New Roman"/>
+        </w:rPr>
+      </w:pPr>
     </w:p>
     <w:p>
       <w:pPr>
@@ -126,24 +682,1498 @@
         </w:sectPr>
       </w:pPr>
     </w:p>
+    <w:p>
+      <w:r>
+        <w:fldChar w:fldCharType="begin"/>
+      </w:r>
+      <w:r>
+        <w:instrText xml:space="preserve">TOC \h \o "1-2"</w:instrText>
+      </w:r>
+      <w:r>
+        <w:fldChar w:fldCharType="separate"/>
+      </w:r>
+    </w:p>
+    <w:p/>
+    <w:p>
+      <w:r>
+        <w:fldChar w:fldCharType="end"/>
+      </w:r>
+    </w:p>
     <w:sdt>
       <w:sdtPr>
-        <w:alias w:val="目录"/>
-        <w:id w:val="147468226"/>
+        <w:rPr>
+          <w:rFonts w:ascii="宋体" w:hAnsi="宋体" w:eastAsia="宋体" w:cs="宋体"/>
+          <w:sz w:val="21"/>
+          <w:szCs w:val="21"/>
+        </w:rPr>
+        <w:id w:val="147462179"/>
+        <w15:color w:val="DBDBDB"/>
+        <w:docPartObj>
+          <w:docPartGallery w:val="Table of Contents"/>
+          <w:docPartUnique/>
+        </w:docPartObj>
       </w:sdtPr>
       <w:sdtContent>
         <w:p>
-          <w:r>
-            <w:fldChar w:fldCharType="begin"/>
-          </w:r>
-          <w:r>
-            <w:instrText xml:space="preserve">TOC \h \o "1-2"</w:instrText>
-          </w:r>
-          <w:r>
-            <w:fldChar w:fldCharType="separate"/>
+          <w:pPr>
+            <w:spacing w:before="0" w:beforeLines="0" w:after="0" w:afterLines="0" w:line="240" w:lineRule="auto"/>
+            <w:ind w:left="0" w:leftChars="0" w:right="0" w:rightChars="0" w:firstLine="0" w:firstLineChars="0"/>
+            <w:jc w:val="center"/>
+          </w:pPr>
+          <w:r>
+            <w:rPr>
+              <w:rFonts w:ascii="宋体" w:hAnsi="宋体" w:eastAsia="宋体"/>
+              <w:sz w:val="21"/>
+            </w:rPr>
+            <w:t>目录</w:t>
           </w:r>
         </w:p>
         <w:p>
+          <w:pPr>
+            <w:pStyle w:val="9"/>
+            <w:tabs>
+              <w:tab w:val="right" w:leader="dot" w:pos="9360"/>
+            </w:tabs>
+          </w:pPr>
+          <w:r>
+            <w:fldChar w:fldCharType="begin"/>
+          </w:r>
+          <w:r>
+            <w:instrText xml:space="preserve">TOC \o "1-2" \h \u </w:instrText>
+          </w:r>
+          <w:r>
+            <w:fldChar w:fldCharType="separate"/>
+          </w:r>
+          <w:r>
+            <w:fldChar w:fldCharType="begin"/>
+          </w:r>
+          <w:r>
+            <w:instrText xml:space="preserve"> HYPERLINK \l _Toc8818 </w:instrText>
+          </w:r>
+          <w:r>
+            <w:fldChar w:fldCharType="separate"/>
+          </w:r>
+          <w:r>
+            <w:rPr>
+              <w:rFonts w:ascii="黑体" w:hAnsi="黑体" w:eastAsia="黑体" w:cs="黑体"/>
+              <w:bCs/>
+              <w:szCs w:val="32"/>
+            </w:rPr>
+            <w:t>一、系统需求</w:t>
+          </w:r>
+          <w:r>
+            <w:tab/>
+          </w:r>
+          <w:r>
+            <w:fldChar w:fldCharType="begin"/>
+          </w:r>
+          <w:r>
+            <w:instrText xml:space="preserve"> PAGEREF _Toc8818 \h </w:instrText>
+          </w:r>
+          <w:r>
+            <w:fldChar w:fldCharType="separate"/>
+          </w:r>
+          <w:r>
+            <w:t>3</w:t>
+          </w:r>
+          <w:r>
+            <w:fldChar w:fldCharType="end"/>
+          </w:r>
+          <w:r>
+            <w:fldChar w:fldCharType="end"/>
+          </w:r>
+        </w:p>
+        <w:p>
+          <w:pPr>
+            <w:pStyle w:val="11"/>
+            <w:tabs>
+              <w:tab w:val="right" w:leader="dot" w:pos="9360"/>
+            </w:tabs>
+          </w:pPr>
+          <w:r>
+            <w:fldChar w:fldCharType="begin"/>
+          </w:r>
+          <w:r>
+            <w:instrText xml:space="preserve"> HYPERLINK \l _Toc20598 </w:instrText>
+          </w:r>
+          <w:r>
+            <w:fldChar w:fldCharType="separate"/>
+          </w:r>
+          <w:r>
+            <w:rPr>
+              <w:rFonts w:ascii="黑体" w:hAnsi="黑体" w:eastAsia="黑体" w:cs="黑体"/>
+              <w:bCs/>
+              <w:szCs w:val="28"/>
+            </w:rPr>
+            <w:t>1.1 设计目的</w:t>
+          </w:r>
+          <w:r>
+            <w:tab/>
+          </w:r>
+          <w:r>
+            <w:fldChar w:fldCharType="begin"/>
+          </w:r>
+          <w:r>
+            <w:instrText xml:space="preserve"> PAGEREF _Toc20598 \h </w:instrText>
+          </w:r>
+          <w:r>
+            <w:fldChar w:fldCharType="separate"/>
+          </w:r>
+          <w:r>
+            <w:t>3</w:t>
+          </w:r>
+          <w:r>
+            <w:fldChar w:fldCharType="end"/>
+          </w:r>
+          <w:r>
+            <w:fldChar w:fldCharType="end"/>
+          </w:r>
+        </w:p>
+        <w:p>
+          <w:pPr>
+            <w:pStyle w:val="11"/>
+            <w:tabs>
+              <w:tab w:val="right" w:leader="dot" w:pos="9360"/>
+            </w:tabs>
+          </w:pPr>
+          <w:r>
+            <w:fldChar w:fldCharType="begin"/>
+          </w:r>
+          <w:r>
+            <w:instrText xml:space="preserve"> HYPERLINK \l _Toc31197 </w:instrText>
+          </w:r>
+          <w:r>
+            <w:fldChar w:fldCharType="separate"/>
+          </w:r>
+          <w:r>
+            <w:rPr>
+              <w:rFonts w:ascii="黑体" w:hAnsi="黑体" w:eastAsia="黑体" w:cs="黑体"/>
+              <w:bCs/>
+              <w:szCs w:val="28"/>
+            </w:rPr>
+            <w:t>1.2 功能需求</w:t>
+          </w:r>
+          <w:r>
+            <w:tab/>
+          </w:r>
+          <w:r>
+            <w:fldChar w:fldCharType="begin"/>
+          </w:r>
+          <w:r>
+            <w:instrText xml:space="preserve"> PAGEREF _Toc31197 \h </w:instrText>
+          </w:r>
+          <w:r>
+            <w:fldChar w:fldCharType="separate"/>
+          </w:r>
+          <w:r>
+            <w:t>3</w:t>
+          </w:r>
+          <w:r>
+            <w:fldChar w:fldCharType="end"/>
+          </w:r>
+          <w:r>
+            <w:fldChar w:fldCharType="end"/>
+          </w:r>
+        </w:p>
+        <w:p>
+          <w:pPr>
+            <w:pStyle w:val="11"/>
+            <w:tabs>
+              <w:tab w:val="right" w:leader="dot" w:pos="9360"/>
+            </w:tabs>
+          </w:pPr>
+          <w:r>
+            <w:fldChar w:fldCharType="begin"/>
+          </w:r>
+          <w:r>
+            <w:instrText xml:space="preserve"> HYPERLINK \l _Toc32511 </w:instrText>
+          </w:r>
+          <w:r>
+            <w:fldChar w:fldCharType="separate"/>
+          </w:r>
+          <w:r>
+            <w:rPr>
+              <w:rFonts w:ascii="黑体" w:hAnsi="黑体" w:eastAsia="黑体" w:cs="黑体"/>
+              <w:bCs/>
+              <w:szCs w:val="28"/>
+            </w:rPr>
+            <w:t>1.3 非功能性需求</w:t>
+          </w:r>
+          <w:r>
+            <w:tab/>
+          </w:r>
+          <w:r>
+            <w:fldChar w:fldCharType="begin"/>
+          </w:r>
+          <w:r>
+            <w:instrText xml:space="preserve"> PAGEREF _Toc32511 \h </w:instrText>
+          </w:r>
+          <w:r>
+            <w:fldChar w:fldCharType="separate"/>
+          </w:r>
+          <w:r>
+            <w:t>3</w:t>
+          </w:r>
+          <w:r>
+            <w:fldChar w:fldCharType="end"/>
+          </w:r>
+          <w:r>
+            <w:fldChar w:fldCharType="end"/>
+          </w:r>
+        </w:p>
+        <w:p>
+          <w:pPr>
+            <w:pStyle w:val="9"/>
+            <w:tabs>
+              <w:tab w:val="right" w:leader="dot" w:pos="9360"/>
+            </w:tabs>
+          </w:pPr>
+          <w:r>
+            <w:fldChar w:fldCharType="begin"/>
+          </w:r>
+          <w:r>
+            <w:instrText xml:space="preserve"> HYPERLINK \l _Toc22663 </w:instrText>
+          </w:r>
+          <w:r>
+            <w:fldChar w:fldCharType="separate"/>
+          </w:r>
+          <w:r>
+            <w:rPr>
+              <w:rFonts w:ascii="黑体" w:hAnsi="黑体" w:eastAsia="黑体" w:cs="黑体"/>
+              <w:bCs/>
+              <w:szCs w:val="32"/>
+            </w:rPr>
+            <w:t>二、概要设计</w:t>
+          </w:r>
+          <w:r>
+            <w:tab/>
+          </w:r>
+          <w:r>
+            <w:fldChar w:fldCharType="begin"/>
+          </w:r>
+          <w:r>
+            <w:instrText xml:space="preserve"> PAGEREF _Toc22663 \h </w:instrText>
+          </w:r>
+          <w:r>
+            <w:fldChar w:fldCharType="separate"/>
+          </w:r>
+          <w:r>
+            <w:t>3</w:t>
+          </w:r>
+          <w:r>
+            <w:fldChar w:fldCharType="end"/>
+          </w:r>
+          <w:r>
+            <w:fldChar w:fldCharType="end"/>
+          </w:r>
+        </w:p>
+        <w:p>
+          <w:pPr>
+            <w:pStyle w:val="11"/>
+            <w:tabs>
+              <w:tab w:val="right" w:leader="dot" w:pos="9360"/>
+            </w:tabs>
+          </w:pPr>
+          <w:r>
+            <w:fldChar w:fldCharType="begin"/>
+          </w:r>
+          <w:r>
+            <w:instrText xml:space="preserve"> HYPERLINK \l _Toc2648 </w:instrText>
+          </w:r>
+          <w:r>
+            <w:fldChar w:fldCharType="separate"/>
+          </w:r>
+          <w:r>
+            <w:rPr>
+              <w:rFonts w:ascii="黑体" w:hAnsi="黑体" w:eastAsia="黑体" w:cs="黑体"/>
+              <w:bCs/>
+              <w:szCs w:val="28"/>
+            </w:rPr>
+            <w:t>2.1 技术栈选择</w:t>
+          </w:r>
+          <w:r>
+            <w:tab/>
+          </w:r>
+          <w:r>
+            <w:fldChar w:fldCharType="begin"/>
+          </w:r>
+          <w:r>
+            <w:instrText xml:space="preserve"> PAGEREF _Toc2648 \h </w:instrText>
+          </w:r>
+          <w:r>
+            <w:fldChar w:fldCharType="separate"/>
+          </w:r>
+          <w:r>
+            <w:t>3</w:t>
+          </w:r>
+          <w:r>
+            <w:fldChar w:fldCharType="end"/>
+          </w:r>
+          <w:r>
+            <w:fldChar w:fldCharType="end"/>
+          </w:r>
+        </w:p>
+        <w:p>
+          <w:pPr>
+            <w:pStyle w:val="11"/>
+            <w:tabs>
+              <w:tab w:val="right" w:leader="dot" w:pos="9360"/>
+            </w:tabs>
+          </w:pPr>
+          <w:r>
+            <w:fldChar w:fldCharType="begin"/>
+          </w:r>
+          <w:r>
+            <w:instrText xml:space="preserve"> HYPERLINK \l _Toc3606 </w:instrText>
+          </w:r>
+          <w:r>
+            <w:fldChar w:fldCharType="separate"/>
+          </w:r>
+          <w:r>
+            <w:rPr>
+              <w:rFonts w:ascii="黑体" w:hAnsi="黑体" w:eastAsia="黑体" w:cs="黑体"/>
+              <w:bCs/>
+              <w:szCs w:val="28"/>
+            </w:rPr>
+            <w:t>2.2 系统架构</w:t>
+          </w:r>
+          <w:r>
+            <w:tab/>
+          </w:r>
+          <w:r>
+            <w:fldChar w:fldCharType="begin"/>
+          </w:r>
+          <w:r>
+            <w:instrText xml:space="preserve"> PAGEREF _Toc3606 \h </w:instrText>
+          </w:r>
+          <w:r>
+            <w:fldChar w:fldCharType="separate"/>
+          </w:r>
+          <w:r>
+            <w:t>4</w:t>
+          </w:r>
+          <w:r>
+            <w:fldChar w:fldCharType="end"/>
+          </w:r>
+          <w:r>
+            <w:fldChar w:fldCharType="end"/>
+          </w:r>
+        </w:p>
+        <w:p>
+          <w:pPr>
+            <w:pStyle w:val="11"/>
+            <w:tabs>
+              <w:tab w:val="right" w:leader="dot" w:pos="9360"/>
+            </w:tabs>
+          </w:pPr>
+          <w:r>
+            <w:fldChar w:fldCharType="begin"/>
+          </w:r>
+          <w:r>
+            <w:instrText xml:space="preserve"> HYPERLINK \l _Toc31225 </w:instrText>
+          </w:r>
+          <w:r>
+            <w:fldChar w:fldCharType="separate"/>
+          </w:r>
+          <w:r>
+            <w:rPr>
+              <w:rFonts w:ascii="黑体" w:hAnsi="黑体" w:eastAsia="黑体" w:cs="黑体"/>
+              <w:bCs/>
+              <w:szCs w:val="28"/>
+            </w:rPr>
+            <w:t>2.3 模块职责表</w:t>
+          </w:r>
+          <w:r>
+            <w:tab/>
+          </w:r>
+          <w:r>
+            <w:fldChar w:fldCharType="begin"/>
+          </w:r>
+          <w:r>
+            <w:instrText xml:space="preserve"> PAGEREF _Toc31225 \h </w:instrText>
+          </w:r>
+          <w:r>
+            <w:fldChar w:fldCharType="separate"/>
+          </w:r>
+          <w:r>
+            <w:t>4</w:t>
+          </w:r>
+          <w:r>
+            <w:fldChar w:fldCharType="end"/>
+          </w:r>
+          <w:r>
+            <w:fldChar w:fldCharType="end"/>
+          </w:r>
+        </w:p>
+        <w:p>
+          <w:pPr>
+            <w:pStyle w:val="11"/>
+            <w:tabs>
+              <w:tab w:val="right" w:leader="dot" w:pos="9360"/>
+            </w:tabs>
+          </w:pPr>
+          <w:r>
+            <w:fldChar w:fldCharType="begin"/>
+          </w:r>
+          <w:r>
+            <w:instrText xml:space="preserve"> HYPERLINK \l _Toc18666 </w:instrText>
+          </w:r>
+          <w:r>
+            <w:fldChar w:fldCharType="separate"/>
+          </w:r>
+          <w:r>
+            <w:rPr>
+              <w:rFonts w:ascii="黑体" w:hAnsi="黑体" w:eastAsia="黑体" w:cs="黑体"/>
+              <w:bCs/>
+              <w:szCs w:val="28"/>
+            </w:rPr>
+            <w:t>2.4 数据流</w:t>
+          </w:r>
+          <w:r>
+            <w:tab/>
+          </w:r>
+          <w:r>
+            <w:fldChar w:fldCharType="begin"/>
+          </w:r>
+          <w:r>
+            <w:instrText xml:space="preserve"> PAGEREF _Toc18666 \h </w:instrText>
+          </w:r>
+          <w:r>
+            <w:fldChar w:fldCharType="separate"/>
+          </w:r>
+          <w:r>
+            <w:t>4</w:t>
+          </w:r>
+          <w:r>
+            <w:fldChar w:fldCharType="end"/>
+          </w:r>
+          <w:r>
+            <w:fldChar w:fldCharType="end"/>
+          </w:r>
+        </w:p>
+        <w:p>
+          <w:pPr>
+            <w:pStyle w:val="9"/>
+            <w:tabs>
+              <w:tab w:val="right" w:leader="dot" w:pos="9360"/>
+            </w:tabs>
+          </w:pPr>
+          <w:r>
+            <w:fldChar w:fldCharType="begin"/>
+          </w:r>
+          <w:r>
+            <w:instrText xml:space="preserve"> HYPERLINK \l _Toc31869 </w:instrText>
+          </w:r>
+          <w:r>
+            <w:fldChar w:fldCharType="separate"/>
+          </w:r>
+          <w:r>
+            <w:rPr>
+              <w:rFonts w:ascii="黑体" w:hAnsi="黑体" w:eastAsia="黑体" w:cs="黑体"/>
+              <w:bCs/>
+              <w:szCs w:val="32"/>
+            </w:rPr>
+            <w:t>三、详细设计</w:t>
+          </w:r>
+          <w:r>
+            <w:tab/>
+          </w:r>
+          <w:r>
+            <w:fldChar w:fldCharType="begin"/>
+          </w:r>
+          <w:r>
+            <w:instrText xml:space="preserve"> PAGEREF _Toc31869 \h </w:instrText>
+          </w:r>
+          <w:r>
+            <w:fldChar w:fldCharType="separate"/>
+          </w:r>
+          <w:r>
+            <w:t>5</w:t>
+          </w:r>
+          <w:r>
+            <w:fldChar w:fldCharType="end"/>
+          </w:r>
+          <w:r>
+            <w:fldChar w:fldCharType="end"/>
+          </w:r>
+        </w:p>
+        <w:p>
+          <w:pPr>
+            <w:pStyle w:val="11"/>
+            <w:tabs>
+              <w:tab w:val="right" w:leader="dot" w:pos="9360"/>
+            </w:tabs>
+          </w:pPr>
+          <w:r>
+            <w:fldChar w:fldCharType="begin"/>
+          </w:r>
+          <w:r>
+            <w:instrText xml:space="preserve"> HYPERLINK \l _Toc14335 </w:instrText>
+          </w:r>
+          <w:r>
+            <w:fldChar w:fldCharType="separate"/>
+          </w:r>
+          <w:r>
+            <w:rPr>
+              <w:rFonts w:ascii="黑体" w:hAnsi="黑体" w:eastAsia="黑体" w:cs="黑体"/>
+              <w:bCs/>
+              <w:szCs w:val="28"/>
+            </w:rPr>
+            <w:t>3.1 端口状态模型</w:t>
+          </w:r>
+          <w:r>
+            <w:tab/>
+          </w:r>
+          <w:r>
+            <w:fldChar w:fldCharType="begin"/>
+          </w:r>
+          <w:r>
+            <w:instrText xml:space="preserve"> PAGEREF _Toc14335 \h </w:instrText>
+          </w:r>
+          <w:r>
+            <w:fldChar w:fldCharType="separate"/>
+          </w:r>
+          <w:r>
+            <w:t>5</w:t>
+          </w:r>
+          <w:r>
+            <w:fldChar w:fldCharType="end"/>
+          </w:r>
+          <w:r>
+            <w:fldChar w:fldCharType="end"/>
+          </w:r>
+        </w:p>
+        <w:p>
+          <w:pPr>
+            <w:pStyle w:val="11"/>
+            <w:tabs>
+              <w:tab w:val="right" w:leader="dot" w:pos="9360"/>
+            </w:tabs>
+          </w:pPr>
+          <w:r>
+            <w:fldChar w:fldCharType="begin"/>
+          </w:r>
+          <w:r>
+            <w:instrText xml:space="preserve"> HYPERLINK \l _Toc7290 </w:instrText>
+          </w:r>
+          <w:r>
+            <w:fldChar w:fldCharType="separate"/>
+          </w:r>
+          <w:r>
+            <w:rPr>
+              <w:rFonts w:ascii="黑体" w:hAnsi="黑体" w:eastAsia="黑体" w:cs="黑体"/>
+              <w:bCs/>
+              <w:szCs w:val="28"/>
+            </w:rPr>
+            <w:t>3.2 TCP 扫描流程</w:t>
+          </w:r>
+          <w:r>
+            <w:tab/>
+          </w:r>
+          <w:r>
+            <w:fldChar w:fldCharType="begin"/>
+          </w:r>
+          <w:r>
+            <w:instrText xml:space="preserve"> PAGEREF _Toc7290 \h </w:instrText>
+          </w:r>
+          <w:r>
+            <w:fldChar w:fldCharType="separate"/>
+          </w:r>
+          <w:r>
+            <w:t>5</w:t>
+          </w:r>
+          <w:r>
+            <w:fldChar w:fldCharType="end"/>
+          </w:r>
+          <w:r>
+            <w:fldChar w:fldCharType="end"/>
+          </w:r>
+        </w:p>
+        <w:p>
+          <w:pPr>
+            <w:pStyle w:val="11"/>
+            <w:tabs>
+              <w:tab w:val="right" w:leader="dot" w:pos="9360"/>
+            </w:tabs>
+          </w:pPr>
+          <w:r>
+            <w:fldChar w:fldCharType="begin"/>
+          </w:r>
+          <w:r>
+            <w:instrText xml:space="preserve"> HYPERLINK \l _Toc7415 </w:instrText>
+          </w:r>
+          <w:r>
+            <w:fldChar w:fldCharType="separate"/>
+          </w:r>
+          <w:r>
+            <w:rPr>
+              <w:rFonts w:ascii="黑体" w:hAnsi="黑体" w:eastAsia="黑体" w:cs="黑体"/>
+              <w:bCs/>
+              <w:szCs w:val="28"/>
+            </w:rPr>
+            <w:t>3.3 ICMP 主机发现</w:t>
+          </w:r>
+          <w:r>
+            <w:tab/>
+          </w:r>
+          <w:r>
+            <w:fldChar w:fldCharType="begin"/>
+          </w:r>
+          <w:r>
+            <w:instrText xml:space="preserve"> PAGEREF _Toc7415 \h </w:instrText>
+          </w:r>
+          <w:r>
+            <w:fldChar w:fldCharType="separate"/>
+          </w:r>
+          <w:r>
+            <w:t>5</w:t>
+          </w:r>
+          <w:r>
+            <w:fldChar w:fldCharType="end"/>
+          </w:r>
+          <w:r>
+            <w:fldChar w:fldCharType="end"/>
+          </w:r>
+        </w:p>
+        <w:p>
+          <w:pPr>
+            <w:pStyle w:val="11"/>
+            <w:tabs>
+              <w:tab w:val="right" w:leader="dot" w:pos="9360"/>
+            </w:tabs>
+          </w:pPr>
+          <w:r>
+            <w:fldChar w:fldCharType="begin"/>
+          </w:r>
+          <w:r>
+            <w:instrText xml:space="preserve"> HYPERLINK \l _Toc30945 </w:instrText>
+          </w:r>
+          <w:r>
+            <w:fldChar w:fldCharType="separate"/>
+          </w:r>
+          <w:r>
+            <w:rPr>
+              <w:rFonts w:ascii="黑体" w:hAnsi="黑体" w:eastAsia="黑体" w:cs="黑体"/>
+              <w:bCs/>
+              <w:szCs w:val="28"/>
+            </w:rPr>
+            <w:t>3.4 IP 与端口解析</w:t>
+          </w:r>
+          <w:r>
+            <w:tab/>
+          </w:r>
+          <w:r>
+            <w:fldChar w:fldCharType="begin"/>
+          </w:r>
+          <w:r>
+            <w:instrText xml:space="preserve"> PAGEREF _Toc30945 \h </w:instrText>
+          </w:r>
+          <w:r>
+            <w:fldChar w:fldCharType="separate"/>
+          </w:r>
+          <w:r>
+            <w:t>5</w:t>
+          </w:r>
+          <w:r>
+            <w:fldChar w:fldCharType="end"/>
+          </w:r>
+          <w:r>
+            <w:fldChar w:fldCharType="end"/>
+          </w:r>
+        </w:p>
+        <w:p>
+          <w:pPr>
+            <w:pStyle w:val="11"/>
+            <w:tabs>
+              <w:tab w:val="right" w:leader="dot" w:pos="9360"/>
+            </w:tabs>
+          </w:pPr>
+          <w:r>
+            <w:fldChar w:fldCharType="begin"/>
+          </w:r>
+          <w:r>
+            <w:instrText xml:space="preserve"> HYPERLINK \l _Toc22388 </w:instrText>
+          </w:r>
+          <w:r>
+            <w:fldChar w:fldCharType="separate"/>
+          </w:r>
+          <w:r>
+            <w:rPr>
+              <w:rFonts w:ascii="黑体" w:hAnsi="黑体" w:eastAsia="黑体" w:cs="黑体"/>
+              <w:bCs/>
+              <w:szCs w:val="28"/>
+            </w:rPr>
+            <w:t>3.5 服务名称识别</w:t>
+          </w:r>
+          <w:r>
+            <w:tab/>
+          </w:r>
+          <w:r>
+            <w:fldChar w:fldCharType="begin"/>
+          </w:r>
+          <w:r>
+            <w:instrText xml:space="preserve"> PAGEREF _Toc22388 \h </w:instrText>
+          </w:r>
+          <w:r>
+            <w:fldChar w:fldCharType="separate"/>
+          </w:r>
+          <w:r>
+            <w:t>6</w:t>
+          </w:r>
+          <w:r>
+            <w:fldChar w:fldCharType="end"/>
+          </w:r>
+          <w:r>
+            <w:fldChar w:fldCharType="end"/>
+          </w:r>
+        </w:p>
+        <w:p>
+          <w:pPr>
+            <w:pStyle w:val="11"/>
+            <w:tabs>
+              <w:tab w:val="right" w:leader="dot" w:pos="9360"/>
+            </w:tabs>
+          </w:pPr>
+          <w:r>
+            <w:fldChar w:fldCharType="begin"/>
+          </w:r>
+          <w:r>
+            <w:instrText xml:space="preserve"> HYPERLINK \l _Toc1400 </w:instrText>
+          </w:r>
+          <w:r>
+            <w:fldChar w:fldCharType="separate"/>
+          </w:r>
+          <w:r>
+            <w:rPr>
+              <w:rFonts w:ascii="黑体" w:hAnsi="黑体" w:eastAsia="黑体" w:cs="黑体"/>
+              <w:bCs/>
+              <w:szCs w:val="28"/>
+            </w:rPr>
+            <w:t>3.6 GUI 界面设计</w:t>
+          </w:r>
+          <w:r>
+            <w:tab/>
+          </w:r>
+          <w:r>
+            <w:fldChar w:fldCharType="begin"/>
+          </w:r>
+          <w:r>
+            <w:instrText xml:space="preserve"> PAGEREF _Toc1400 \h </w:instrText>
+          </w:r>
+          <w:r>
+            <w:fldChar w:fldCharType="separate"/>
+          </w:r>
+          <w:r>
+            <w:t>6</w:t>
+          </w:r>
+          <w:r>
+            <w:fldChar w:fldCharType="end"/>
+          </w:r>
+          <w:r>
+            <w:fldChar w:fldCharType="end"/>
+          </w:r>
+        </w:p>
+        <w:p>
+          <w:pPr>
+            <w:pStyle w:val="11"/>
+            <w:tabs>
+              <w:tab w:val="right" w:leader="dot" w:pos="9360"/>
+            </w:tabs>
+          </w:pPr>
+          <w:r>
+            <w:fldChar w:fldCharType="begin"/>
+          </w:r>
+          <w:r>
+            <w:instrText xml:space="preserve"> HYPERLINK \l _Toc31776 </w:instrText>
+          </w:r>
+          <w:r>
+            <w:fldChar w:fldCharType="separate"/>
+          </w:r>
+          <w:r>
+            <w:rPr>
+              <w:rFonts w:ascii="黑体" w:hAnsi="黑体" w:eastAsia="黑体" w:cs="黑体"/>
+              <w:bCs/>
+              <w:szCs w:val="28"/>
+            </w:rPr>
+            <w:t>3.7 报告生成</w:t>
+          </w:r>
+          <w:r>
+            <w:tab/>
+          </w:r>
+          <w:r>
+            <w:fldChar w:fldCharType="begin"/>
+          </w:r>
+          <w:r>
+            <w:instrText xml:space="preserve"> PAGEREF _Toc31776 \h </w:instrText>
+          </w:r>
+          <w:r>
+            <w:fldChar w:fldCharType="separate"/>
+          </w:r>
+          <w:r>
+            <w:t>6</w:t>
+          </w:r>
+          <w:r>
+            <w:fldChar w:fldCharType="end"/>
+          </w:r>
+          <w:r>
+            <w:fldChar w:fldCharType="end"/>
+          </w:r>
+        </w:p>
+        <w:p>
+          <w:pPr>
+            <w:pStyle w:val="11"/>
+            <w:tabs>
+              <w:tab w:val="right" w:leader="dot" w:pos="9360"/>
+            </w:tabs>
+          </w:pPr>
+          <w:r>
+            <w:fldChar w:fldCharType="begin"/>
+          </w:r>
+          <w:r>
+            <w:instrText xml:space="preserve"> HYPERLINK \l _Toc15422 </w:instrText>
+          </w:r>
+          <w:r>
+            <w:fldChar w:fldCharType="separate"/>
+          </w:r>
+          <w:r>
+            <w:rPr>
+              <w:rFonts w:ascii="黑体" w:hAnsi="黑体" w:eastAsia="黑体" w:cs="黑体"/>
+              <w:bCs/>
+              <w:szCs w:val="28"/>
+            </w:rPr>
+            <w:t>3.8 CLI 命令行接口</w:t>
+          </w:r>
+          <w:r>
+            <w:tab/>
+          </w:r>
+          <w:r>
+            <w:fldChar w:fldCharType="begin"/>
+          </w:r>
+          <w:r>
+            <w:instrText xml:space="preserve"> PAGEREF _Toc15422 \h </w:instrText>
+          </w:r>
+          <w:r>
+            <w:fldChar w:fldCharType="separate"/>
+          </w:r>
+          <w:r>
+            <w:t>7</w:t>
+          </w:r>
+          <w:r>
+            <w:fldChar w:fldCharType="end"/>
+          </w:r>
+          <w:r>
+            <w:fldChar w:fldCharType="end"/>
+          </w:r>
+        </w:p>
+        <w:p>
+          <w:pPr>
+            <w:pStyle w:val="9"/>
+            <w:tabs>
+              <w:tab w:val="right" w:leader="dot" w:pos="9360"/>
+            </w:tabs>
+          </w:pPr>
+          <w:r>
+            <w:fldChar w:fldCharType="begin"/>
+          </w:r>
+          <w:r>
+            <w:instrText xml:space="preserve"> HYPERLINK \l _Toc23829 </w:instrText>
+          </w:r>
+          <w:r>
+            <w:fldChar w:fldCharType="separate"/>
+          </w:r>
+          <w:r>
+            <w:rPr>
+              <w:rFonts w:ascii="黑体" w:hAnsi="黑体" w:eastAsia="黑体" w:cs="黑体"/>
+              <w:bCs/>
+              <w:szCs w:val="32"/>
+            </w:rPr>
+            <w:t>四、测试</w:t>
+          </w:r>
+          <w:r>
+            <w:tab/>
+          </w:r>
+          <w:r>
+            <w:fldChar w:fldCharType="begin"/>
+          </w:r>
+          <w:r>
+            <w:instrText xml:space="preserve"> PAGEREF _Toc23829 \h </w:instrText>
+          </w:r>
+          <w:r>
+            <w:fldChar w:fldCharType="separate"/>
+          </w:r>
+          <w:r>
+            <w:t>7</w:t>
+          </w:r>
+          <w:r>
+            <w:fldChar w:fldCharType="end"/>
+          </w:r>
+          <w:r>
+            <w:fldChar w:fldCharType="end"/>
+          </w:r>
+        </w:p>
+        <w:p>
+          <w:pPr>
+            <w:pStyle w:val="11"/>
+            <w:tabs>
+              <w:tab w:val="right" w:leader="dot" w:pos="9360"/>
+            </w:tabs>
+          </w:pPr>
+          <w:r>
+            <w:fldChar w:fldCharType="begin"/>
+          </w:r>
+          <w:r>
+            <w:instrText xml:space="preserve"> HYPERLINK \l _Toc11946 </w:instrText>
+          </w:r>
+          <w:r>
+            <w:fldChar w:fldCharType="separate"/>
+          </w:r>
+          <w:r>
+            <w:rPr>
+              <w:rFonts w:ascii="黑体" w:hAnsi="黑体" w:eastAsia="黑体" w:cs="黑体"/>
+              <w:bCs/>
+              <w:szCs w:val="28"/>
+            </w:rPr>
+            <w:t>4.1 测试策略</w:t>
+          </w:r>
+          <w:r>
+            <w:tab/>
+          </w:r>
+          <w:r>
+            <w:fldChar w:fldCharType="begin"/>
+          </w:r>
+          <w:r>
+            <w:instrText xml:space="preserve"> PAGEREF _Toc11946 \h </w:instrText>
+          </w:r>
+          <w:r>
+            <w:fldChar w:fldCharType="separate"/>
+          </w:r>
+          <w:r>
+            <w:t>7</w:t>
+          </w:r>
+          <w:r>
+            <w:fldChar w:fldCharType="end"/>
+          </w:r>
+          <w:r>
+            <w:fldChar w:fldCharType="end"/>
+          </w:r>
+        </w:p>
+        <w:p>
+          <w:pPr>
+            <w:pStyle w:val="11"/>
+            <w:tabs>
+              <w:tab w:val="right" w:leader="dot" w:pos="9360"/>
+            </w:tabs>
+          </w:pPr>
+          <w:r>
+            <w:fldChar w:fldCharType="begin"/>
+          </w:r>
+          <w:r>
+            <w:instrText xml:space="preserve"> HYPERLINK \l _Toc22159 </w:instrText>
+          </w:r>
+          <w:r>
+            <w:fldChar w:fldCharType="separate"/>
+          </w:r>
+          <w:r>
+            <w:rPr>
+              <w:rFonts w:ascii="黑体" w:hAnsi="黑体" w:eastAsia="黑体" w:cs="黑体"/>
+              <w:bCs/>
+              <w:szCs w:val="28"/>
+            </w:rPr>
+            <w:t>4.2 测试结果</w:t>
+          </w:r>
+          <w:r>
+            <w:tab/>
+          </w:r>
+          <w:r>
+            <w:fldChar w:fldCharType="begin"/>
+          </w:r>
+          <w:r>
+            <w:instrText xml:space="preserve"> PAGEREF _Toc22159 \h </w:instrText>
+          </w:r>
+          <w:r>
+            <w:fldChar w:fldCharType="separate"/>
+          </w:r>
+          <w:r>
+            <w:t>7</w:t>
+          </w:r>
+          <w:r>
+            <w:fldChar w:fldCharType="end"/>
+          </w:r>
+          <w:r>
+            <w:fldChar w:fldCharType="end"/>
+          </w:r>
+        </w:p>
+        <w:p>
+          <w:pPr>
+            <w:pStyle w:val="11"/>
+            <w:tabs>
+              <w:tab w:val="right" w:leader="dot" w:pos="9360"/>
+            </w:tabs>
+          </w:pPr>
+          <w:r>
+            <w:fldChar w:fldCharType="begin"/>
+          </w:r>
+          <w:r>
+            <w:instrText xml:space="preserve"> HYPERLINK \l _Toc7717 </w:instrText>
+          </w:r>
+          <w:r>
+            <w:fldChar w:fldCharType="separate"/>
+          </w:r>
+          <w:r>
+            <w:rPr>
+              <w:rFonts w:ascii="黑体" w:hAnsi="黑体" w:eastAsia="黑体" w:cs="黑体"/>
+              <w:bCs/>
+              <w:szCs w:val="28"/>
+            </w:rPr>
+            <w:t>4.3 功能验证</w:t>
+          </w:r>
+          <w:r>
+            <w:tab/>
+          </w:r>
+          <w:r>
+            <w:fldChar w:fldCharType="begin"/>
+          </w:r>
+          <w:r>
+            <w:instrText xml:space="preserve"> PAGEREF _Toc7717 \h </w:instrText>
+          </w:r>
+          <w:r>
+            <w:fldChar w:fldCharType="separate"/>
+          </w:r>
+          <w:r>
+            <w:t>8</w:t>
+          </w:r>
+          <w:r>
+            <w:fldChar w:fldCharType="end"/>
+          </w:r>
+          <w:r>
+            <w:fldChar w:fldCharType="end"/>
+          </w:r>
+        </w:p>
+        <w:p>
+          <w:pPr>
+            <w:pStyle w:val="9"/>
+            <w:tabs>
+              <w:tab w:val="right" w:leader="dot" w:pos="9360"/>
+            </w:tabs>
+          </w:pPr>
+          <w:r>
+            <w:fldChar w:fldCharType="begin"/>
+          </w:r>
+          <w:r>
+            <w:instrText xml:space="preserve"> HYPERLINK \l _Toc2562 </w:instrText>
+          </w:r>
+          <w:r>
+            <w:fldChar w:fldCharType="separate"/>
+          </w:r>
+          <w:r>
+            <w:rPr>
+              <w:rFonts w:ascii="黑体" w:hAnsi="黑体" w:eastAsia="黑体" w:cs="黑体"/>
+              <w:bCs/>
+              <w:szCs w:val="32"/>
+            </w:rPr>
+            <w:t>五、程序详细设计说明</w:t>
+          </w:r>
+          <w:r>
+            <w:tab/>
+          </w:r>
+          <w:r>
+            <w:fldChar w:fldCharType="begin"/>
+          </w:r>
+          <w:r>
+            <w:instrText xml:space="preserve"> PAGEREF _Toc2562 \h </w:instrText>
+          </w:r>
+          <w:r>
+            <w:fldChar w:fldCharType="separate"/>
+          </w:r>
+          <w:r>
+            <w:t>8</w:t>
+          </w:r>
+          <w:r>
+            <w:fldChar w:fldCharType="end"/>
+          </w:r>
+          <w:r>
+            <w:fldChar w:fldCharType="end"/>
+          </w:r>
+        </w:p>
+        <w:p>
+          <w:pPr>
+            <w:pStyle w:val="11"/>
+            <w:tabs>
+              <w:tab w:val="right" w:leader="dot" w:pos="9360"/>
+            </w:tabs>
+          </w:pPr>
+          <w:r>
+            <w:fldChar w:fldCharType="begin"/>
+          </w:r>
+          <w:r>
+            <w:instrText xml:space="preserve"> HYPERLINK \l _Toc15676 </w:instrText>
+          </w:r>
+          <w:r>
+            <w:fldChar w:fldCharType="separate"/>
+          </w:r>
+          <w:r>
+            <w:rPr>
+              <w:rFonts w:ascii="黑体" w:hAnsi="黑体" w:eastAsia="黑体" w:cs="黑体"/>
+              <w:bCs/>
+              <w:szCs w:val="28"/>
+            </w:rPr>
+            <w:t>5.1 项目结构</w:t>
+          </w:r>
+          <w:r>
+            <w:tab/>
+          </w:r>
+          <w:r>
+            <w:fldChar w:fldCharType="begin"/>
+          </w:r>
+          <w:r>
+            <w:instrText xml:space="preserve"> PAGEREF _Toc15676 \h </w:instrText>
+          </w:r>
+          <w:r>
+            <w:fldChar w:fldCharType="separate"/>
+          </w:r>
+          <w:r>
+            <w:t>8</w:t>
+          </w:r>
+          <w:r>
+            <w:fldChar w:fldCharType="end"/>
+          </w:r>
+          <w:r>
+            <w:fldChar w:fldCharType="end"/>
+          </w:r>
+        </w:p>
+        <w:p>
+          <w:pPr>
+            <w:pStyle w:val="11"/>
+            <w:tabs>
+              <w:tab w:val="right" w:leader="dot" w:pos="9360"/>
+            </w:tabs>
+          </w:pPr>
+          <w:r>
+            <w:fldChar w:fldCharType="begin"/>
+          </w:r>
+          <w:r>
+            <w:instrText xml:space="preserve"> HYPERLINK \l _Toc17164 </w:instrText>
+          </w:r>
+          <w:r>
+            <w:fldChar w:fldCharType="separate"/>
+          </w:r>
+          <w:r>
+            <w:rPr>
+              <w:rFonts w:ascii="黑体" w:hAnsi="黑体" w:eastAsia="黑体" w:cs="黑体"/>
+              <w:bCs/>
+              <w:szCs w:val="28"/>
+            </w:rPr>
+            <w:t>5.2 关键数据结构</w:t>
+          </w:r>
+          <w:r>
+            <w:tab/>
+          </w:r>
+          <w:r>
+            <w:fldChar w:fldCharType="begin"/>
+          </w:r>
+          <w:r>
+            <w:instrText xml:space="preserve"> PAGEREF _Toc17164 \h </w:instrText>
+          </w:r>
+          <w:r>
+            <w:fldChar w:fldCharType="separate"/>
+          </w:r>
+          <w:r>
+            <w:t>8</w:t>
+          </w:r>
+          <w:r>
+            <w:fldChar w:fldCharType="end"/>
+          </w:r>
+          <w:r>
+            <w:fldChar w:fldCharType="end"/>
+          </w:r>
+        </w:p>
+        <w:p>
+          <w:pPr>
+            <w:pStyle w:val="11"/>
+            <w:tabs>
+              <w:tab w:val="right" w:leader="dot" w:pos="9360"/>
+            </w:tabs>
+          </w:pPr>
+          <w:r>
+            <w:fldChar w:fldCharType="begin"/>
+          </w:r>
+          <w:r>
+            <w:instrText xml:space="preserve"> HYPERLINK \l _Toc1870 </w:instrText>
+          </w:r>
+          <w:r>
+            <w:fldChar w:fldCharType="separate"/>
+          </w:r>
+          <w:r>
+            <w:rPr>
+              <w:rFonts w:ascii="黑体" w:hAnsi="黑体" w:eastAsia="黑体" w:cs="黑体"/>
+              <w:bCs/>
+              <w:szCs w:val="28"/>
+            </w:rPr>
+            <w:t>5.3 双回调模式</w:t>
+          </w:r>
+          <w:r>
+            <w:tab/>
+          </w:r>
+          <w:r>
+            <w:fldChar w:fldCharType="begin"/>
+          </w:r>
+          <w:r>
+            <w:instrText xml:space="preserve"> PAGEREF _Toc1870 \h </w:instrText>
+          </w:r>
+          <w:r>
+            <w:fldChar w:fldCharType="separate"/>
+          </w:r>
+          <w:r>
+            <w:t>8</w:t>
+          </w:r>
+          <w:r>
+            <w:fldChar w:fldCharType="end"/>
+          </w:r>
+          <w:r>
+            <w:fldChar w:fldCharType="end"/>
+          </w:r>
+        </w:p>
+        <w:p>
+          <w:pPr>
+            <w:pStyle w:val="11"/>
+            <w:tabs>
+              <w:tab w:val="right" w:leader="dot" w:pos="9360"/>
+            </w:tabs>
+          </w:pPr>
+          <w:r>
+            <w:fldChar w:fldCharType="begin"/>
+          </w:r>
+          <w:r>
+            <w:instrText xml:space="preserve"> HYPERLINK \l _Toc23779 </w:instrText>
+          </w:r>
+          <w:r>
+            <w:fldChar w:fldCharType="separate"/>
+          </w:r>
+          <w:r>
+            <w:rPr>
+              <w:rFonts w:ascii="黑体" w:hAnsi="黑体" w:eastAsia="黑体" w:cs="黑体"/>
+              <w:bCs/>
+              <w:szCs w:val="28"/>
+            </w:rPr>
+            <w:t>5.4 线程安全设计</w:t>
+          </w:r>
+          <w:r>
+            <w:tab/>
+          </w:r>
+          <w:r>
+            <w:fldChar w:fldCharType="begin"/>
+          </w:r>
+          <w:r>
+            <w:instrText xml:space="preserve"> PAGEREF _Toc23779 \h </w:instrText>
+          </w:r>
+          <w:r>
+            <w:fldChar w:fldCharType="separate"/>
+          </w:r>
+          <w:r>
+            <w:t>9</w:t>
+          </w:r>
+          <w:r>
+            <w:fldChar w:fldCharType="end"/>
+          </w:r>
+          <w:r>
+            <w:fldChar w:fldCharType="end"/>
+          </w:r>
+        </w:p>
+        <w:p>
+          <w:pPr>
+            <w:pStyle w:val="9"/>
+            <w:tabs>
+              <w:tab w:val="right" w:leader="dot" w:pos="9360"/>
+            </w:tabs>
+          </w:pPr>
+          <w:r>
+            <w:fldChar w:fldCharType="begin"/>
+          </w:r>
+          <w:r>
+            <w:instrText xml:space="preserve"> HYPERLINK \l _Toc19143 </w:instrText>
+          </w:r>
+          <w:r>
+            <w:fldChar w:fldCharType="separate"/>
+          </w:r>
+          <w:r>
+            <w:rPr>
+              <w:rFonts w:ascii="黑体" w:hAnsi="黑体" w:eastAsia="黑体" w:cs="黑体"/>
+              <w:bCs/>
+              <w:szCs w:val="32"/>
+            </w:rPr>
+            <w:t>六、收获与总结</w:t>
+          </w:r>
+          <w:r>
+            <w:tab/>
+          </w:r>
+          <w:r>
+            <w:fldChar w:fldCharType="begin"/>
+          </w:r>
+          <w:r>
+            <w:instrText xml:space="preserve"> PAGEREF _Toc19143 \h </w:instrText>
+          </w:r>
+          <w:r>
+            <w:fldChar w:fldCharType="separate"/>
+          </w:r>
+          <w:r>
+            <w:t>9</w:t>
+          </w:r>
+          <w:r>
+            <w:fldChar w:fldCharType="end"/>
+          </w:r>
+          <w:r>
+            <w:fldChar w:fldCharType="end"/>
+          </w:r>
+        </w:p>
+        <w:p>
+          <w:pPr>
+            <w:pStyle w:val="11"/>
+            <w:tabs>
+              <w:tab w:val="right" w:leader="dot" w:pos="9360"/>
+            </w:tabs>
+          </w:pPr>
+          <w:r>
+            <w:fldChar w:fldCharType="begin"/>
+          </w:r>
+          <w:r>
+            <w:instrText xml:space="preserve"> HYPERLINK \l _Toc29730 </w:instrText>
+          </w:r>
+          <w:r>
+            <w:fldChar w:fldCharType="separate"/>
+          </w:r>
+          <w:r>
+            <w:rPr>
+              <w:rFonts w:ascii="黑体" w:hAnsi="黑体" w:eastAsia="黑体" w:cs="黑体"/>
+              <w:bCs/>
+              <w:szCs w:val="28"/>
+            </w:rPr>
+            <w:t>6.1 技术收获</w:t>
+          </w:r>
+          <w:r>
+            <w:tab/>
+          </w:r>
+          <w:r>
+            <w:fldChar w:fldCharType="begin"/>
+          </w:r>
+          <w:r>
+            <w:instrText xml:space="preserve"> PAGEREF _Toc29730 \h </w:instrText>
+          </w:r>
+          <w:r>
+            <w:fldChar w:fldCharType="separate"/>
+          </w:r>
+          <w:r>
+            <w:t>9</w:t>
+          </w:r>
+          <w:r>
+            <w:fldChar w:fldCharType="end"/>
+          </w:r>
+          <w:r>
+            <w:fldChar w:fldCharType="end"/>
+          </w:r>
+        </w:p>
+        <w:p>
+          <w:pPr>
+            <w:pStyle w:val="11"/>
+            <w:tabs>
+              <w:tab w:val="right" w:leader="dot" w:pos="9360"/>
+            </w:tabs>
+          </w:pPr>
+          <w:r>
+            <w:fldChar w:fldCharType="begin"/>
+          </w:r>
+          <w:r>
+            <w:instrText xml:space="preserve"> HYPERLINK \l _Toc8749 </w:instrText>
+          </w:r>
+          <w:r>
+            <w:fldChar w:fldCharType="separate"/>
+          </w:r>
+          <w:r>
+            <w:rPr>
+              <w:rFonts w:ascii="黑体" w:hAnsi="黑体" w:eastAsia="黑体" w:cs="黑体"/>
+              <w:bCs/>
+              <w:szCs w:val="28"/>
+            </w:rPr>
+            <w:t>6.2 设计心得</w:t>
+          </w:r>
+          <w:r>
+            <w:tab/>
+          </w:r>
+          <w:r>
+            <w:fldChar w:fldCharType="begin"/>
+          </w:r>
+          <w:r>
+            <w:instrText xml:space="preserve"> PAGEREF _Toc8749 \h </w:instrText>
+          </w:r>
+          <w:r>
+            <w:fldChar w:fldCharType="separate"/>
+          </w:r>
+          <w:r>
+            <w:t>9</w:t>
+          </w:r>
+          <w:r>
+            <w:fldChar w:fldCharType="end"/>
+          </w:r>
+          <w:r>
+            <w:fldChar w:fldCharType="end"/>
+          </w:r>
+        </w:p>
+        <w:p>
+          <w:pPr>
+            <w:pStyle w:val="11"/>
+            <w:tabs>
+              <w:tab w:val="right" w:leader="dot" w:pos="9360"/>
+            </w:tabs>
+          </w:pPr>
+          <w:r>
+            <w:fldChar w:fldCharType="begin"/>
+          </w:r>
+          <w:r>
+            <w:instrText xml:space="preserve"> HYPERLINK \l _Toc20524 </w:instrText>
+          </w:r>
+          <w:r>
+            <w:fldChar w:fldCharType="separate"/>
+          </w:r>
+          <w:r>
+            <w:rPr>
+              <w:rFonts w:ascii="黑体" w:hAnsi="黑体" w:eastAsia="黑体" w:cs="黑体"/>
+              <w:bCs/>
+              <w:szCs w:val="28"/>
+            </w:rPr>
+            <w:t>6.3 不足与改进方向</w:t>
+          </w:r>
+          <w:r>
+            <w:tab/>
+          </w:r>
+          <w:r>
+            <w:fldChar w:fldCharType="begin"/>
+          </w:r>
+          <w:r>
+            <w:instrText xml:space="preserve"> PAGEREF _Toc20524 \h </w:instrText>
+          </w:r>
+          <w:r>
+            <w:fldChar w:fldCharType="separate"/>
+          </w:r>
+          <w:r>
+            <w:t>9</w:t>
+          </w:r>
+          <w:r>
+            <w:fldChar w:fldCharType="end"/>
+          </w:r>
+          <w:r>
+            <w:fldChar w:fldCharType="end"/>
+          </w:r>
+        </w:p>
+        <w:p>
+          <w:pPr>
+            <w:sectPr>
+              <w:headerReference r:id="rId5" w:type="default"/>
+              <w:footerReference r:id="rId6" w:type="default"/>
+              <w:pgSz w:w="12240" w:h="15840"/>
+              <w:pgMar w:top="1440" w:right="1440" w:bottom="1440" w:left="1440" w:header="708" w:footer="708" w:gutter="0"/>
+              <w:cols w:space="720" w:num="1"/>
+              <w:docGrid w:linePitch="360" w:charSpace="0"/>
+            </w:sectPr>
+          </w:pPr>
           <w:r>
             <w:fldChar w:fldCharType="end"/>
           </w:r>
@@ -151,15 +2181,11 @@
       </w:sdtContent>
     </w:sdt>
     <w:p>
-      <w:r>
-        <w:br w:type="page"/>
-      </w:r>
-    </w:p>
-    <w:p>
       <w:pPr>
         <w:pStyle w:val="2"/>
         <w:spacing w:before="360" w:after="180"/>
       </w:pPr>
+      <w:bookmarkStart w:id="0" w:name="_Toc8818"/>
       <w:r>
         <w:rPr>
           <w:rFonts w:ascii="黑体" w:hAnsi="黑体" w:eastAsia="黑体" w:cs="黑体"/>
@@ -170,12 +2196,14 @@
         </w:rPr>
         <w:t>一、系统需求</w:t>
       </w:r>
+      <w:bookmarkEnd w:id="0"/>
     </w:p>
     <w:p>
       <w:pPr>
         <w:pStyle w:val="3"/>
         <w:spacing w:before="240" w:after="180"/>
       </w:pPr>
+      <w:bookmarkStart w:id="1" w:name="_Toc20598"/>
       <w:r>
         <w:rPr>
           <w:rFonts w:ascii="黑体" w:hAnsi="黑体" w:eastAsia="黑体" w:cs="黑体"/>
@@ -186,10 +2214,11 @@
         </w:rPr>
         <w:t>1.1 设计目的</w:t>
       </w:r>
-    </w:p>
-    <w:p>
-      <w:pPr>
-        <w:pStyle w:val="16"/>
+      <w:bookmarkEnd w:id="1"/>
+    </w:p>
+    <w:p>
+      <w:pPr>
+        <w:pStyle w:val="18"/>
         <w:numPr>
           <w:ilvl w:val="0"/>
           <w:numId w:val="1"/>
@@ -207,7 +2236,7 @@
     </w:p>
     <w:p>
       <w:pPr>
-        <w:pStyle w:val="16"/>
+        <w:pStyle w:val="18"/>
         <w:numPr>
           <w:ilvl w:val="0"/>
           <w:numId w:val="1"/>
@@ -225,7 +2254,7 @@
     </w:p>
     <w:p>
       <w:pPr>
-        <w:pStyle w:val="16"/>
+        <w:pStyle w:val="18"/>
         <w:numPr>
           <w:ilvl w:val="0"/>
           <w:numId w:val="1"/>
@@ -246,6 +2275,7 @@
         <w:pStyle w:val="3"/>
         <w:spacing w:before="240" w:after="180"/>
       </w:pPr>
+      <w:bookmarkStart w:id="2" w:name="_Toc31197"/>
       <w:r>
         <w:rPr>
           <w:rFonts w:ascii="黑体" w:hAnsi="黑体" w:eastAsia="黑体" w:cs="黑体"/>
@@ -256,6 +2286,7 @@
         </w:rPr>
         <w:t>1.2 功能需求</w:t>
       </w:r>
+      <w:bookmarkEnd w:id="2"/>
     </w:p>
     <w:p>
       <w:pPr>
@@ -272,7 +2303,7 @@
     </w:p>
     <w:p>
       <w:pPr>
-        <w:pStyle w:val="16"/>
+        <w:pStyle w:val="18"/>
         <w:numPr>
           <w:ilvl w:val="0"/>
           <w:numId w:val="1"/>
@@ -290,7 +2321,7 @@
     </w:p>
     <w:p>
       <w:pPr>
-        <w:pStyle w:val="16"/>
+        <w:pStyle w:val="18"/>
         <w:numPr>
           <w:ilvl w:val="0"/>
           <w:numId w:val="1"/>
@@ -308,7 +2339,7 @@
     </w:p>
     <w:p>
       <w:pPr>
-        <w:pStyle w:val="16"/>
+        <w:pStyle w:val="18"/>
         <w:numPr>
           <w:ilvl w:val="0"/>
           <w:numId w:val="1"/>
@@ -326,7 +2357,7 @@
     </w:p>
     <w:p>
       <w:pPr>
-        <w:pStyle w:val="16"/>
+        <w:pStyle w:val="18"/>
         <w:numPr>
           <w:ilvl w:val="0"/>
           <w:numId w:val="1"/>
@@ -344,7 +2375,7 @@
     </w:p>
     <w:p>
       <w:pPr>
-        <w:pStyle w:val="16"/>
+        <w:pStyle w:val="18"/>
         <w:numPr>
           <w:ilvl w:val="0"/>
           <w:numId w:val="1"/>
@@ -362,7 +2393,7 @@
     </w:p>
     <w:p>
       <w:pPr>
-        <w:pStyle w:val="16"/>
+        <w:pStyle w:val="18"/>
         <w:numPr>
           <w:ilvl w:val="0"/>
           <w:numId w:val="1"/>
@@ -380,7 +2411,7 @@
     </w:p>
     <w:p>
       <w:pPr>
-        <w:pStyle w:val="16"/>
+        <w:pStyle w:val="18"/>
         <w:numPr>
           <w:ilvl w:val="0"/>
           <w:numId w:val="1"/>
@@ -398,7 +2429,7 @@
     </w:p>
     <w:p>
       <w:pPr>
-        <w:pStyle w:val="16"/>
+        <w:pStyle w:val="18"/>
         <w:numPr>
           <w:ilvl w:val="0"/>
           <w:numId w:val="1"/>
@@ -419,6 +2450,7 @@
         <w:pStyle w:val="3"/>
         <w:spacing w:before="240" w:after="180"/>
       </w:pPr>
+      <w:bookmarkStart w:id="3" w:name="_Toc32511"/>
       <w:r>
         <w:rPr>
           <w:rFonts w:ascii="黑体" w:hAnsi="黑体" w:eastAsia="黑体" w:cs="黑体"/>
@@ -429,10 +2461,11 @@
         </w:rPr>
         <w:t>1.3 非功能性需求</w:t>
       </w:r>
-    </w:p>
-    <w:p>
-      <w:pPr>
-        <w:pStyle w:val="16"/>
+      <w:bookmarkEnd w:id="3"/>
+    </w:p>
+    <w:p>
+      <w:pPr>
+        <w:pStyle w:val="18"/>
         <w:numPr>
           <w:ilvl w:val="0"/>
           <w:numId w:val="1"/>
@@ -450,7 +2483,7 @@
     </w:p>
     <w:p>
       <w:pPr>
-        <w:pStyle w:val="16"/>
+        <w:pStyle w:val="18"/>
         <w:numPr>
           <w:ilvl w:val="0"/>
           <w:numId w:val="1"/>
@@ -468,7 +2501,7 @@
     </w:p>
     <w:p>
       <w:pPr>
-        <w:pStyle w:val="16"/>
+        <w:pStyle w:val="18"/>
         <w:numPr>
           <w:ilvl w:val="0"/>
           <w:numId w:val="1"/>
@@ -486,7 +2519,7 @@
     </w:p>
     <w:p>
       <w:pPr>
-        <w:pStyle w:val="16"/>
+        <w:pStyle w:val="18"/>
         <w:numPr>
           <w:ilvl w:val="0"/>
           <w:numId w:val="1"/>
@@ -504,7 +2537,7 @@
     </w:p>
     <w:p>
       <w:pPr>
-        <w:pStyle w:val="16"/>
+        <w:pStyle w:val="18"/>
         <w:numPr>
           <w:ilvl w:val="0"/>
           <w:numId w:val="1"/>
@@ -522,7 +2555,7 @@
     </w:p>
     <w:p>
       <w:pPr>
-        <w:pStyle w:val="16"/>
+        <w:pStyle w:val="18"/>
         <w:numPr>
           <w:ilvl w:val="0"/>
           <w:numId w:val="1"/>
@@ -540,7 +2573,7 @@
     </w:p>
     <w:p>
       <w:pPr>
-        <w:pStyle w:val="16"/>
+        <w:pStyle w:val="18"/>
         <w:numPr>
           <w:ilvl w:val="0"/>
           <w:numId w:val="1"/>
@@ -561,6 +2594,7 @@
         <w:pStyle w:val="2"/>
         <w:spacing w:before="360" w:after="180"/>
       </w:pPr>
+      <w:bookmarkStart w:id="4" w:name="_Toc22663"/>
       <w:r>
         <w:rPr>
           <w:rFonts w:ascii="黑体" w:hAnsi="黑体" w:eastAsia="黑体" w:cs="黑体"/>
@@ -571,12 +2605,14 @@
         </w:rPr>
         <w:t>二、概要设计</w:t>
       </w:r>
+      <w:bookmarkEnd w:id="4"/>
     </w:p>
     <w:p>
       <w:pPr>
         <w:pStyle w:val="3"/>
         <w:spacing w:before="240" w:after="180"/>
       </w:pPr>
+      <w:bookmarkStart w:id="5" w:name="_Toc2648"/>
       <w:r>
         <w:rPr>
           <w:rFonts w:ascii="黑体" w:hAnsi="黑体" w:eastAsia="黑体" w:cs="黑体"/>
@@ -587,6 +2623,7 @@
         </w:rPr>
         <w:t>2.1 技术栈选择</w:t>
       </w:r>
+      <w:bookmarkEnd w:id="5"/>
     </w:p>
     <w:p>
       <w:pPr>
@@ -642,6 +2679,7 @@
         <w:pStyle w:val="3"/>
         <w:spacing w:before="240" w:after="180"/>
       </w:pPr>
+      <w:bookmarkStart w:id="6" w:name="_Toc3606"/>
       <w:r>
         <w:rPr>
           <w:rFonts w:ascii="黑体" w:hAnsi="黑体" w:eastAsia="黑体" w:cs="黑体"/>
@@ -652,6 +2690,7 @@
         </w:rPr>
         <w:t>2.2 系统架构</w:t>
       </w:r>
+      <w:bookmarkEnd w:id="6"/>
     </w:p>
     <w:p>
       <w:pPr>
@@ -821,6 +2860,7 @@
         <w:pStyle w:val="3"/>
         <w:spacing w:before="240" w:after="180"/>
       </w:pPr>
+      <w:bookmarkStart w:id="7" w:name="_Toc31225"/>
       <w:r>
         <w:rPr>
           <w:rFonts w:ascii="黑体" w:hAnsi="黑体" w:eastAsia="黑体" w:cs="黑体"/>
@@ -831,10 +2871,11 @@
         </w:rPr>
         <w:t>2.3 模块职责表</w:t>
       </w:r>
+      <w:bookmarkEnd w:id="7"/>
     </w:p>
     <w:tbl>
       <w:tblPr>
-        <w:tblStyle w:val="11"/>
+        <w:tblStyle w:val="13"/>
         <w:tblW w:w="9360" w:type="dxa"/>
         <w:tblInd w:w="0" w:type="dxa"/>
         <w:tblBorders>
@@ -1863,6 +3904,7 @@
         <w:pStyle w:val="3"/>
         <w:spacing w:before="240" w:after="180"/>
       </w:pPr>
+      <w:bookmarkStart w:id="8" w:name="_Toc18666"/>
       <w:r>
         <w:rPr>
           <w:rFonts w:ascii="黑体" w:hAnsi="黑体" w:eastAsia="黑体" w:cs="黑体"/>
@@ -1873,6 +3915,7 @@
         </w:rPr>
         <w:t>2.4 数据流</w:t>
       </w:r>
+      <w:bookmarkEnd w:id="8"/>
     </w:p>
     <w:p>
       <w:pPr>
@@ -1897,6 +3940,7 @@
         <w:pStyle w:val="2"/>
         <w:spacing w:before="360" w:after="180"/>
       </w:pPr>
+      <w:bookmarkStart w:id="9" w:name="_Toc31869"/>
       <w:r>
         <w:rPr>
           <w:rFonts w:ascii="黑体" w:hAnsi="黑体" w:eastAsia="黑体" w:cs="黑体"/>
@@ -1907,12 +3951,14 @@
         </w:rPr>
         <w:t>三、详细设计</w:t>
       </w:r>
+      <w:bookmarkEnd w:id="9"/>
     </w:p>
     <w:p>
       <w:pPr>
         <w:pStyle w:val="3"/>
         <w:spacing w:before="240" w:after="180"/>
       </w:pPr>
+      <w:bookmarkStart w:id="10" w:name="_Toc14335"/>
       <w:r>
         <w:rPr>
           <w:rFonts w:ascii="黑体" w:hAnsi="黑体" w:eastAsia="黑体" w:cs="黑体"/>
@@ -1923,6 +3969,7 @@
         </w:rPr>
         <w:t>3.1 端口状态模型</w:t>
       </w:r>
+      <w:bookmarkEnd w:id="10"/>
     </w:p>
     <w:p>
       <w:pPr>
@@ -1939,7 +3986,7 @@
     </w:p>
     <w:tbl>
       <w:tblPr>
-        <w:tblStyle w:val="11"/>
+        <w:tblStyle w:val="13"/>
         <w:tblW w:w="9360" w:type="dxa"/>
         <w:tblInd w:w="0" w:type="dxa"/>
         <w:tblBorders>
@@ -2473,6 +4520,7 @@
         <w:pStyle w:val="3"/>
         <w:spacing w:before="240" w:after="180"/>
       </w:pPr>
+      <w:bookmarkStart w:id="11" w:name="_Toc7290"/>
       <w:r>
         <w:rPr>
           <w:rFonts w:ascii="黑体" w:hAnsi="黑体" w:eastAsia="黑体" w:cs="黑体"/>
@@ -2483,6 +4531,7 @@
         </w:rPr>
         <w:t>3.2 TCP 扫描流程</w:t>
       </w:r>
+      <w:bookmarkEnd w:id="11"/>
     </w:p>
     <w:p>
       <w:pPr>
@@ -2571,6 +4620,7 @@
         <w:pStyle w:val="3"/>
         <w:spacing w:before="240" w:after="180"/>
       </w:pPr>
+      <w:bookmarkStart w:id="12" w:name="_Toc7415"/>
       <w:r>
         <w:rPr>
           <w:rFonts w:ascii="黑体" w:hAnsi="黑体" w:eastAsia="黑体" w:cs="黑体"/>
@@ -2581,6 +4631,7 @@
         </w:rPr>
         <w:t>3.3 ICMP 主机发现</w:t>
       </w:r>
+      <w:bookmarkEnd w:id="12"/>
     </w:p>
     <w:p>
       <w:pPr>
@@ -2607,7 +4658,7 @@
     </w:p>
     <w:p>
       <w:pPr>
-        <w:pStyle w:val="16"/>
+        <w:pStyle w:val="18"/>
         <w:numPr>
           <w:ilvl w:val="0"/>
           <w:numId w:val="1"/>
@@ -2625,7 +4676,7 @@
     </w:p>
     <w:p>
       <w:pPr>
-        <w:pStyle w:val="16"/>
+        <w:pStyle w:val="18"/>
         <w:numPr>
           <w:ilvl w:val="0"/>
           <w:numId w:val="1"/>
@@ -2643,7 +4694,7 @@
     </w:p>
     <w:p>
       <w:pPr>
-        <w:pStyle w:val="16"/>
+        <w:pStyle w:val="18"/>
         <w:numPr>
           <w:ilvl w:val="0"/>
           <w:numId w:val="1"/>
@@ -2661,7 +4712,7 @@
     </w:p>
     <w:p>
       <w:pPr>
-        <w:pStyle w:val="16"/>
+        <w:pStyle w:val="18"/>
         <w:numPr>
           <w:ilvl w:val="0"/>
           <w:numId w:val="1"/>
@@ -2682,6 +4733,7 @@
         <w:pStyle w:val="3"/>
         <w:spacing w:before="240" w:after="180"/>
       </w:pPr>
+      <w:bookmarkStart w:id="13" w:name="_Toc30945"/>
       <w:r>
         <w:rPr>
           <w:rFonts w:ascii="黑体" w:hAnsi="黑体" w:eastAsia="黑体" w:cs="黑体"/>
@@ -2692,6 +4744,7 @@
         </w:rPr>
         <w:t>3.4 IP 与端口解析</w:t>
       </w:r>
+      <w:bookmarkEnd w:id="13"/>
     </w:p>
     <w:p>
       <w:pPr>
@@ -2708,7 +4761,7 @@
     </w:p>
     <w:p>
       <w:pPr>
-        <w:pStyle w:val="16"/>
+        <w:pStyle w:val="18"/>
         <w:numPr>
           <w:ilvl w:val="0"/>
           <w:numId w:val="1"/>
@@ -2726,7 +4779,7 @@
     </w:p>
     <w:p>
       <w:pPr>
-        <w:pStyle w:val="16"/>
+        <w:pStyle w:val="18"/>
         <w:numPr>
           <w:ilvl w:val="0"/>
           <w:numId w:val="1"/>
@@ -2744,7 +4797,7 @@
     </w:p>
     <w:p>
       <w:pPr>
-        <w:pStyle w:val="16"/>
+        <w:pStyle w:val="18"/>
         <w:numPr>
           <w:ilvl w:val="0"/>
           <w:numId w:val="1"/>
@@ -2762,7 +4815,7 @@
     </w:p>
     <w:p>
       <w:pPr>
-        <w:pStyle w:val="16"/>
+        <w:pStyle w:val="18"/>
         <w:numPr>
           <w:ilvl w:val="0"/>
           <w:numId w:val="1"/>
@@ -2793,7 +4846,7 @@
     </w:p>
     <w:p>
       <w:pPr>
-        <w:pStyle w:val="16"/>
+        <w:pStyle w:val="18"/>
         <w:numPr>
           <w:ilvl w:val="0"/>
           <w:numId w:val="1"/>
@@ -2811,7 +4864,7 @@
     </w:p>
     <w:p>
       <w:pPr>
-        <w:pStyle w:val="16"/>
+        <w:pStyle w:val="18"/>
         <w:numPr>
           <w:ilvl w:val="0"/>
           <w:numId w:val="1"/>
@@ -2829,7 +4882,7 @@
     </w:p>
     <w:p>
       <w:pPr>
-        <w:pStyle w:val="16"/>
+        <w:pStyle w:val="18"/>
         <w:numPr>
           <w:ilvl w:val="0"/>
           <w:numId w:val="1"/>
@@ -2847,7 +4900,7 @@
     </w:p>
     <w:p>
       <w:pPr>
-        <w:pStyle w:val="16"/>
+        <w:pStyle w:val="18"/>
         <w:numPr>
           <w:ilvl w:val="0"/>
           <w:numId w:val="1"/>
@@ -2868,6 +4921,7 @@
         <w:pStyle w:val="3"/>
         <w:spacing w:before="240" w:after="180"/>
       </w:pPr>
+      <w:bookmarkStart w:id="14" w:name="_Toc22388"/>
       <w:r>
         <w:rPr>
           <w:rFonts w:ascii="黑体" w:hAnsi="黑体" w:eastAsia="黑体" w:cs="黑体"/>
@@ -2878,6 +4932,7 @@
         </w:rPr>
         <w:t>3.5 服务名称识别</w:t>
       </w:r>
+      <w:bookmarkEnd w:id="14"/>
     </w:p>
     <w:p>
       <w:pPr>
@@ -2894,7 +4949,7 @@
     </w:p>
     <w:p>
       <w:pPr>
-        <w:pStyle w:val="16"/>
+        <w:pStyle w:val="18"/>
         <w:numPr>
           <w:ilvl w:val="0"/>
           <w:numId w:val="1"/>
@@ -2912,7 +4967,7 @@
     </w:p>
     <w:p>
       <w:pPr>
-        <w:pStyle w:val="16"/>
+        <w:pStyle w:val="18"/>
         <w:numPr>
           <w:ilvl w:val="0"/>
           <w:numId w:val="1"/>
@@ -2930,7 +4985,7 @@
     </w:p>
     <w:p>
       <w:pPr>
-        <w:pStyle w:val="16"/>
+        <w:pStyle w:val="18"/>
         <w:numPr>
           <w:ilvl w:val="0"/>
           <w:numId w:val="1"/>
@@ -2964,6 +5019,7 @@
         <w:pStyle w:val="3"/>
         <w:spacing w:before="240" w:after="180"/>
       </w:pPr>
+      <w:bookmarkStart w:id="15" w:name="_Toc1400"/>
       <w:r>
         <w:rPr>
           <w:rFonts w:ascii="黑体" w:hAnsi="黑体" w:eastAsia="黑体" w:cs="黑体"/>
@@ -2974,6 +5030,7 @@
         </w:rPr>
         <w:t>3.6 GUI 界面设计</w:t>
       </w:r>
+      <w:bookmarkEnd w:id="15"/>
     </w:p>
     <w:p>
       <w:pPr>
@@ -2990,7 +5047,7 @@
     </w:p>
     <w:p>
       <w:pPr>
-        <w:pStyle w:val="16"/>
+        <w:pStyle w:val="18"/>
         <w:numPr>
           <w:ilvl w:val="0"/>
           <w:numId w:val="1"/>
@@ -3008,7 +5065,7 @@
     </w:p>
     <w:p>
       <w:pPr>
-        <w:pStyle w:val="16"/>
+        <w:pStyle w:val="18"/>
         <w:numPr>
           <w:ilvl w:val="0"/>
           <w:numId w:val="1"/>
@@ -3026,7 +5083,7 @@
     </w:p>
     <w:p>
       <w:pPr>
-        <w:pStyle w:val="16"/>
+        <w:pStyle w:val="18"/>
         <w:numPr>
           <w:ilvl w:val="0"/>
           <w:numId w:val="1"/>
@@ -3057,7 +5114,7 @@
     </w:p>
     <w:p>
       <w:pPr>
-        <w:pStyle w:val="16"/>
+        <w:pStyle w:val="18"/>
         <w:numPr>
           <w:ilvl w:val="0"/>
           <w:numId w:val="1"/>
@@ -3075,7 +5132,7 @@
     </w:p>
     <w:p>
       <w:pPr>
-        <w:pStyle w:val="16"/>
+        <w:pStyle w:val="18"/>
         <w:numPr>
           <w:ilvl w:val="0"/>
           <w:numId w:val="1"/>
@@ -3093,7 +5150,7 @@
     </w:p>
     <w:p>
       <w:pPr>
-        <w:pStyle w:val="16"/>
+        <w:pStyle w:val="18"/>
         <w:numPr>
           <w:ilvl w:val="0"/>
           <w:numId w:val="1"/>
@@ -3111,7 +5168,7 @@
     </w:p>
     <w:p>
       <w:pPr>
-        <w:pStyle w:val="16"/>
+        <w:pStyle w:val="18"/>
         <w:numPr>
           <w:ilvl w:val="0"/>
           <w:numId w:val="1"/>
@@ -3129,7 +5186,7 @@
     </w:p>
     <w:p>
       <w:pPr>
-        <w:pStyle w:val="16"/>
+        <w:pStyle w:val="18"/>
         <w:numPr>
           <w:ilvl w:val="0"/>
           <w:numId w:val="1"/>
@@ -3147,7 +5204,7 @@
     </w:p>
     <w:p>
       <w:pPr>
-        <w:pStyle w:val="16"/>
+        <w:pStyle w:val="18"/>
         <w:numPr>
           <w:ilvl w:val="0"/>
           <w:numId w:val="1"/>
@@ -3194,6 +5251,7 @@
         <w:pStyle w:val="3"/>
         <w:spacing w:before="240" w:after="180"/>
       </w:pPr>
+      <w:bookmarkStart w:id="16" w:name="_Toc31776"/>
       <w:r>
         <w:rPr>
           <w:rFonts w:ascii="黑体" w:hAnsi="黑体" w:eastAsia="黑体" w:cs="黑体"/>
@@ -3204,6 +5262,7 @@
         </w:rPr>
         <w:t>3.7 报告生成</w:t>
       </w:r>
+      <w:bookmarkEnd w:id="16"/>
     </w:p>
     <w:p>
       <w:pPr>
@@ -3220,7 +5279,7 @@
     </w:p>
     <w:p>
       <w:pPr>
-        <w:pStyle w:val="16"/>
+        <w:pStyle w:val="18"/>
         <w:numPr>
           <w:ilvl w:val="0"/>
           <w:numId w:val="1"/>
@@ -3238,7 +5297,7 @@
     </w:p>
     <w:p>
       <w:pPr>
-        <w:pStyle w:val="16"/>
+        <w:pStyle w:val="18"/>
         <w:numPr>
           <w:ilvl w:val="0"/>
           <w:numId w:val="1"/>
@@ -3272,6 +5331,7 @@
         <w:pStyle w:val="3"/>
         <w:spacing w:before="240" w:after="180"/>
       </w:pPr>
+      <w:bookmarkStart w:id="17" w:name="_Toc15422"/>
       <w:r>
         <w:rPr>
           <w:rFonts w:ascii="黑体" w:hAnsi="黑体" w:eastAsia="黑体" w:cs="黑体"/>
@@ -3282,6 +5342,7 @@
         </w:rPr>
         <w:t>3.8 CLI 命令行接口</w:t>
       </w:r>
+      <w:bookmarkEnd w:id="17"/>
     </w:p>
     <w:p>
       <w:pPr>
@@ -3313,7 +5374,7 @@
     </w:p>
     <w:p>
       <w:pPr>
-        <w:pStyle w:val="16"/>
+        <w:pStyle w:val="18"/>
         <w:numPr>
           <w:ilvl w:val="0"/>
           <w:numId w:val="1"/>
@@ -3331,7 +5392,7 @@
     </w:p>
     <w:p>
       <w:pPr>
-        <w:pStyle w:val="16"/>
+        <w:pStyle w:val="18"/>
         <w:numPr>
           <w:ilvl w:val="0"/>
           <w:numId w:val="1"/>
@@ -3349,7 +5410,7 @@
     </w:p>
     <w:p>
       <w:pPr>
-        <w:pStyle w:val="16"/>
+        <w:pStyle w:val="18"/>
         <w:numPr>
           <w:ilvl w:val="0"/>
           <w:numId w:val="1"/>
@@ -3367,7 +5428,7 @@
     </w:p>
     <w:p>
       <w:pPr>
-        <w:pStyle w:val="16"/>
+        <w:pStyle w:val="18"/>
         <w:numPr>
           <w:ilvl w:val="0"/>
           <w:numId w:val="1"/>
@@ -3385,7 +5446,7 @@
     </w:p>
     <w:p>
       <w:pPr>
-        <w:pStyle w:val="16"/>
+        <w:pStyle w:val="18"/>
         <w:numPr>
           <w:ilvl w:val="0"/>
           <w:numId w:val="1"/>
@@ -3403,7 +5464,7 @@
     </w:p>
     <w:p>
       <w:pPr>
-        <w:pStyle w:val="16"/>
+        <w:pStyle w:val="18"/>
         <w:numPr>
           <w:ilvl w:val="0"/>
           <w:numId w:val="1"/>
@@ -3436,7 +5497,7 @@
     </w:p>
     <w:p>
       <w:pPr>
-        <w:pStyle w:val="16"/>
+        <w:pStyle w:val="18"/>
         <w:numPr>
           <w:ilvl w:val="0"/>
           <w:numId w:val="1"/>
@@ -3454,7 +5515,7 @@
     </w:p>
     <w:p>
       <w:pPr>
-        <w:pStyle w:val="16"/>
+        <w:pStyle w:val="18"/>
         <w:numPr>
           <w:ilvl w:val="0"/>
           <w:numId w:val="1"/>
@@ -3472,7 +5533,7 @@
     </w:p>
     <w:p>
       <w:pPr>
-        <w:pStyle w:val="16"/>
+        <w:pStyle w:val="18"/>
         <w:numPr>
           <w:ilvl w:val="0"/>
           <w:numId w:val="1"/>
@@ -3490,7 +5551,7 @@
     </w:p>
     <w:p>
       <w:pPr>
-        <w:pStyle w:val="16"/>
+        <w:pStyle w:val="18"/>
         <w:numPr>
           <w:ilvl w:val="0"/>
           <w:numId w:val="1"/>
@@ -3511,6 +5572,7 @@
         <w:pStyle w:val="2"/>
         <w:spacing w:before="360" w:after="180"/>
       </w:pPr>
+      <w:bookmarkStart w:id="18" w:name="_Toc23829"/>
       <w:r>
         <w:rPr>
           <w:rFonts w:ascii="黑体" w:hAnsi="黑体" w:eastAsia="黑体" w:cs="黑体"/>
@@ -3521,12 +5583,14 @@
         </w:rPr>
         <w:t>四、测试</w:t>
       </w:r>
+      <w:bookmarkEnd w:id="18"/>
     </w:p>
     <w:p>
       <w:pPr>
         <w:pStyle w:val="3"/>
         <w:spacing w:before="240" w:after="180"/>
       </w:pPr>
+      <w:bookmarkStart w:id="19" w:name="_Toc11946"/>
       <w:r>
         <w:rPr>
           <w:rFonts w:ascii="黑体" w:hAnsi="黑体" w:eastAsia="黑体" w:cs="黑体"/>
@@ -3537,6 +5601,7 @@
         </w:rPr>
         <w:t>4.1 测试策略</w:t>
       </w:r>
+      <w:bookmarkEnd w:id="19"/>
     </w:p>
     <w:p>
       <w:pPr>
@@ -3553,7 +5618,7 @@
     </w:p>
     <w:p>
       <w:pPr>
-        <w:pStyle w:val="16"/>
+        <w:pStyle w:val="18"/>
         <w:numPr>
           <w:ilvl w:val="0"/>
           <w:numId w:val="1"/>
@@ -3571,7 +5636,7 @@
     </w:p>
     <w:p>
       <w:pPr>
-        <w:pStyle w:val="16"/>
+        <w:pStyle w:val="18"/>
         <w:numPr>
           <w:ilvl w:val="0"/>
           <w:numId w:val="1"/>
@@ -3589,7 +5654,7 @@
     </w:p>
     <w:p>
       <w:pPr>
-        <w:pStyle w:val="16"/>
+        <w:pStyle w:val="18"/>
         <w:numPr>
           <w:ilvl w:val="0"/>
           <w:numId w:val="1"/>
@@ -3607,7 +5672,7 @@
     </w:p>
     <w:p>
       <w:pPr>
-        <w:pStyle w:val="16"/>
+        <w:pStyle w:val="18"/>
         <w:numPr>
           <w:ilvl w:val="0"/>
           <w:numId w:val="1"/>
@@ -3625,7 +5690,7 @@
     </w:p>
     <w:p>
       <w:pPr>
-        <w:pStyle w:val="16"/>
+        <w:pStyle w:val="18"/>
         <w:numPr>
           <w:ilvl w:val="0"/>
           <w:numId w:val="1"/>
@@ -3646,6 +5711,7 @@
         <w:pStyle w:val="3"/>
         <w:spacing w:before="240" w:after="180"/>
       </w:pPr>
+      <w:bookmarkStart w:id="20" w:name="_Toc22159"/>
       <w:r>
         <w:rPr>
           <w:rFonts w:ascii="黑体" w:hAnsi="黑体" w:eastAsia="黑体" w:cs="黑体"/>
@@ -3656,6 +5722,7 @@
         </w:rPr>
         <w:t>4.2 测试结果</w:t>
       </w:r>
+      <w:bookmarkEnd w:id="20"/>
     </w:p>
     <w:p>
       <w:pPr>
@@ -3718,6 +5785,7 @@
         <w:pStyle w:val="3"/>
         <w:spacing w:before="240" w:after="180"/>
       </w:pPr>
+      <w:bookmarkStart w:id="21" w:name="_Toc7717"/>
       <w:r>
         <w:rPr>
           <w:rFonts w:ascii="黑体" w:hAnsi="黑体" w:eastAsia="黑体" w:cs="黑体"/>
@@ -3728,6 +5796,7 @@
         </w:rPr>
         <w:t>4.3 功能验证</w:t>
       </w:r>
+      <w:bookmarkEnd w:id="21"/>
     </w:p>
     <w:p>
       <w:pPr>
@@ -3744,7 +5813,7 @@
     </w:p>
     <w:p>
       <w:pPr>
-        <w:pStyle w:val="16"/>
+        <w:pStyle w:val="18"/>
         <w:numPr>
           <w:ilvl w:val="0"/>
           <w:numId w:val="1"/>
@@ -3762,7 +5831,7 @@
     </w:p>
     <w:p>
       <w:pPr>
-        <w:pStyle w:val="16"/>
+        <w:pStyle w:val="18"/>
         <w:numPr>
           <w:ilvl w:val="0"/>
           <w:numId w:val="1"/>
@@ -3780,7 +5849,7 @@
     </w:p>
     <w:p>
       <w:pPr>
-        <w:pStyle w:val="16"/>
+        <w:pStyle w:val="18"/>
         <w:numPr>
           <w:ilvl w:val="0"/>
           <w:numId w:val="1"/>
@@ -3798,7 +5867,7 @@
     </w:p>
     <w:p>
       <w:pPr>
-        <w:pStyle w:val="16"/>
+        <w:pStyle w:val="18"/>
         <w:numPr>
           <w:ilvl w:val="0"/>
           <w:numId w:val="1"/>
@@ -3819,6 +5888,7 @@
         <w:pStyle w:val="2"/>
         <w:spacing w:before="360" w:after="180"/>
       </w:pPr>
+      <w:bookmarkStart w:id="22" w:name="_Toc2562"/>
       <w:r>
         <w:rPr>
           <w:rFonts w:ascii="黑体" w:hAnsi="黑体" w:eastAsia="黑体" w:cs="黑体"/>
@@ -3829,12 +5899,14 @@
         </w:rPr>
         <w:t>五、程序详细设计说明</w:t>
       </w:r>
+      <w:bookmarkEnd w:id="22"/>
     </w:p>
     <w:p>
       <w:pPr>
         <w:pStyle w:val="3"/>
         <w:spacing w:before="240" w:after="180"/>
       </w:pPr>
+      <w:bookmarkStart w:id="23" w:name="_Toc15676"/>
       <w:r>
         <w:rPr>
           <w:rFonts w:ascii="黑体" w:hAnsi="黑体" w:eastAsia="黑体" w:cs="黑体"/>
@@ -3845,6 +5917,7 @@
         </w:rPr>
         <w:t>5.1 项目结构</w:t>
       </w:r>
+      <w:bookmarkEnd w:id="23"/>
     </w:p>
     <w:p>
       <w:pPr>
@@ -4108,6 +6181,7 @@
         <w:pStyle w:val="3"/>
         <w:spacing w:before="240" w:after="180"/>
       </w:pPr>
+      <w:bookmarkStart w:id="24" w:name="_Toc17164"/>
       <w:r>
         <w:rPr>
           <w:rFonts w:ascii="黑体" w:hAnsi="黑体" w:eastAsia="黑体" w:cs="黑体"/>
@@ -4118,6 +6192,7 @@
         </w:rPr>
         <w:t>5.2 关键数据结构</w:t>
       </w:r>
+      <w:bookmarkEnd w:id="24"/>
     </w:p>
     <w:p>
       <w:pPr>
@@ -4193,6 +6268,7 @@
         <w:pStyle w:val="3"/>
         <w:spacing w:before="240" w:after="180"/>
       </w:pPr>
+      <w:bookmarkStart w:id="25" w:name="_Toc1870"/>
       <w:r>
         <w:rPr>
           <w:rFonts w:ascii="黑体" w:hAnsi="黑体" w:eastAsia="黑体" w:cs="黑体"/>
@@ -4203,6 +6279,7 @@
         </w:rPr>
         <w:t>5.3 双回调模式</w:t>
       </w:r>
+      <w:bookmarkEnd w:id="25"/>
     </w:p>
     <w:p>
       <w:pPr>
@@ -4219,7 +6296,7 @@
     </w:p>
     <w:p>
       <w:pPr>
-        <w:pStyle w:val="16"/>
+        <w:pStyle w:val="18"/>
         <w:numPr>
           <w:ilvl w:val="0"/>
           <w:numId w:val="1"/>
@@ -4237,7 +6314,7 @@
     </w:p>
     <w:p>
       <w:pPr>
-        <w:pStyle w:val="16"/>
+        <w:pStyle w:val="18"/>
         <w:numPr>
           <w:ilvl w:val="0"/>
           <w:numId w:val="1"/>
@@ -4255,7 +6332,7 @@
     </w:p>
     <w:p>
       <w:pPr>
-        <w:pStyle w:val="16"/>
+        <w:pStyle w:val="18"/>
         <w:numPr>
           <w:ilvl w:val="0"/>
           <w:numId w:val="1"/>
@@ -4276,6 +6353,7 @@
         <w:pStyle w:val="3"/>
         <w:spacing w:before="240" w:after="180"/>
       </w:pPr>
+      <w:bookmarkStart w:id="26" w:name="_Toc23779"/>
       <w:r>
         <w:rPr>
           <w:rFonts w:ascii="黑体" w:hAnsi="黑体" w:eastAsia="黑体" w:cs="黑体"/>
@@ -4286,10 +6364,11 @@
         </w:rPr>
         <w:t>5.4 线程安全设计</w:t>
       </w:r>
-    </w:p>
-    <w:p>
-      <w:pPr>
-        <w:pStyle w:val="16"/>
+      <w:bookmarkEnd w:id="26"/>
+    </w:p>
+    <w:p>
+      <w:pPr>
+        <w:pStyle w:val="18"/>
         <w:numPr>
           <w:ilvl w:val="0"/>
           <w:numId w:val="1"/>
@@ -4307,7 +6386,7 @@
     </w:p>
     <w:p>
       <w:pPr>
-        <w:pStyle w:val="16"/>
+        <w:pStyle w:val="18"/>
         <w:numPr>
           <w:ilvl w:val="0"/>
           <w:numId w:val="1"/>
@@ -4325,7 +6404,7 @@
     </w:p>
     <w:p>
       <w:pPr>
-        <w:pStyle w:val="16"/>
+        <w:pStyle w:val="18"/>
         <w:numPr>
           <w:ilvl w:val="0"/>
           <w:numId w:val="1"/>
@@ -4343,7 +6422,7 @@
     </w:p>
     <w:p>
       <w:pPr>
-        <w:pStyle w:val="16"/>
+        <w:pStyle w:val="18"/>
         <w:numPr>
           <w:ilvl w:val="0"/>
           <w:numId w:val="1"/>
@@ -4364,6 +6443,7 @@
         <w:pStyle w:val="2"/>
         <w:spacing w:before="360" w:after="180"/>
       </w:pPr>
+      <w:bookmarkStart w:id="27" w:name="_Toc19143"/>
       <w:r>
         <w:rPr>
           <w:rFonts w:ascii="黑体" w:hAnsi="黑体" w:eastAsia="黑体" w:cs="黑体"/>
@@ -4374,12 +6454,14 @@
         </w:rPr>
         <w:t>六、收获与总结</w:t>
       </w:r>
+      <w:bookmarkEnd w:id="27"/>
     </w:p>
     <w:p>
       <w:pPr>
         <w:pStyle w:val="3"/>
         <w:spacing w:before="240" w:after="180"/>
       </w:pPr>
+      <w:bookmarkStart w:id="28" w:name="_Toc29730"/>
       <w:r>
         <w:rPr>
           <w:rFonts w:ascii="黑体" w:hAnsi="黑体" w:eastAsia="黑体" w:cs="黑体"/>
@@ -4390,10 +6472,11 @@
         </w:rPr>
         <w:t>6.1 技术收获</w:t>
       </w:r>
-    </w:p>
-    <w:p>
-      <w:pPr>
-        <w:pStyle w:val="16"/>
+      <w:bookmarkEnd w:id="28"/>
+    </w:p>
+    <w:p>
+      <w:pPr>
+        <w:pStyle w:val="18"/>
         <w:numPr>
           <w:ilvl w:val="0"/>
           <w:numId w:val="1"/>
@@ -4411,7 +6494,7 @@
     </w:p>
     <w:p>
       <w:pPr>
-        <w:pStyle w:val="16"/>
+        <w:pStyle w:val="18"/>
         <w:numPr>
           <w:ilvl w:val="0"/>
           <w:numId w:val="1"/>
@@ -4429,7 +6512,7 @@
     </w:p>
     <w:p>
       <w:pPr>
-        <w:pStyle w:val="16"/>
+        <w:pStyle w:val="18"/>
         <w:numPr>
           <w:ilvl w:val="0"/>
           <w:numId w:val="1"/>
@@ -4447,7 +6530,7 @@
     </w:p>
     <w:p>
       <w:pPr>
-        <w:pStyle w:val="16"/>
+        <w:pStyle w:val="18"/>
         <w:numPr>
           <w:ilvl w:val="0"/>
           <w:numId w:val="1"/>
@@ -4465,7 +6548,7 @@
     </w:p>
     <w:p>
       <w:pPr>
-        <w:pStyle w:val="16"/>
+        <w:pStyle w:val="18"/>
         <w:numPr>
           <w:ilvl w:val="0"/>
           <w:numId w:val="1"/>
@@ -4483,7 +6566,7 @@
     </w:p>
     <w:p>
       <w:pPr>
-        <w:pStyle w:val="16"/>
+        <w:pStyle w:val="18"/>
         <w:numPr>
           <w:ilvl w:val="0"/>
           <w:numId w:val="1"/>
@@ -4504,6 +6587,7 @@
         <w:pStyle w:val="3"/>
         <w:spacing w:before="240" w:after="180"/>
       </w:pPr>
+      <w:bookmarkStart w:id="29" w:name="_Toc8749"/>
       <w:r>
         <w:rPr>
           <w:rFonts w:ascii="黑体" w:hAnsi="黑体" w:eastAsia="黑体" w:cs="黑体"/>
@@ -4514,10 +6598,11 @@
         </w:rPr>
         <w:t>6.2 设计心得</w:t>
       </w:r>
-    </w:p>
-    <w:p>
-      <w:pPr>
-        <w:pStyle w:val="16"/>
+      <w:bookmarkEnd w:id="29"/>
+    </w:p>
+    <w:p>
+      <w:pPr>
+        <w:pStyle w:val="18"/>
         <w:numPr>
           <w:ilvl w:val="0"/>
           <w:numId w:val="1"/>
@@ -4535,7 +6620,7 @@
     </w:p>
     <w:p>
       <w:pPr>
-        <w:pStyle w:val="16"/>
+        <w:pStyle w:val="18"/>
         <w:numPr>
           <w:ilvl w:val="0"/>
           <w:numId w:val="1"/>
@@ -4553,7 +6638,7 @@
     </w:p>
     <w:p>
       <w:pPr>
-        <w:pStyle w:val="16"/>
+        <w:pStyle w:val="18"/>
         <w:numPr>
           <w:ilvl w:val="0"/>
           <w:numId w:val="1"/>
@@ -4571,7 +6656,7 @@
     </w:p>
     <w:p>
       <w:pPr>
-        <w:pStyle w:val="16"/>
+        <w:pStyle w:val="18"/>
         <w:numPr>
           <w:ilvl w:val="0"/>
           <w:numId w:val="1"/>
@@ -4589,7 +6674,7 @@
     </w:p>
     <w:p>
       <w:pPr>
-        <w:pStyle w:val="16"/>
+        <w:pStyle w:val="18"/>
         <w:numPr>
           <w:ilvl w:val="0"/>
           <w:numId w:val="1"/>
@@ -4607,7 +6692,7 @@
     </w:p>
     <w:p>
       <w:pPr>
-        <w:pStyle w:val="16"/>
+        <w:pStyle w:val="18"/>
         <w:numPr>
           <w:ilvl w:val="0"/>
           <w:numId w:val="1"/>
@@ -4628,6 +6713,7 @@
         <w:pStyle w:val="3"/>
         <w:spacing w:before="240" w:after="180"/>
       </w:pPr>
+      <w:bookmarkStart w:id="30" w:name="_Toc20524"/>
       <w:r>
         <w:rPr>
           <w:rFonts w:ascii="黑体" w:hAnsi="黑体" w:eastAsia="黑体" w:cs="黑体"/>
@@ -4638,10 +6724,11 @@
         </w:rPr>
         <w:t>6.3 不足与改进方向</w:t>
       </w:r>
-    </w:p>
-    <w:p>
-      <w:pPr>
-        <w:pStyle w:val="16"/>
+      <w:bookmarkEnd w:id="30"/>
+    </w:p>
+    <w:p>
+      <w:pPr>
+        <w:pStyle w:val="18"/>
         <w:numPr>
           <w:ilvl w:val="0"/>
           <w:numId w:val="1"/>
@@ -4659,7 +6746,7 @@
     </w:p>
     <w:p>
       <w:pPr>
-        <w:pStyle w:val="16"/>
+        <w:pStyle w:val="18"/>
         <w:numPr>
           <w:ilvl w:val="0"/>
           <w:numId w:val="1"/>
@@ -4677,7 +6764,7 @@
     </w:p>
     <w:p>
       <w:pPr>
-        <w:pStyle w:val="16"/>
+        <w:pStyle w:val="18"/>
         <w:numPr>
           <w:ilvl w:val="0"/>
           <w:numId w:val="1"/>
@@ -4695,7 +6782,7 @@
     </w:p>
     <w:p>
       <w:pPr>
-        <w:pStyle w:val="16"/>
+        <w:pStyle w:val="18"/>
         <w:numPr>
           <w:ilvl w:val="0"/>
           <w:numId w:val="1"/>
@@ -4712,8 +6799,6 @@
       </w:r>
     </w:p>
     <w:sectPr>
-      <w:headerReference r:id="rId5" w:type="default"/>
-      <w:footerReference r:id="rId6" w:type="default"/>
       <w:pgSz w:w="12240" w:h="15840"/>
       <w:pgMar w:top="1440" w:right="1440" w:bottom="1440" w:left="1440" w:header="708" w:footer="708" w:gutter="0"/>
       <w:cols w:space="720" w:num="1"/>
@@ -4958,7 +7043,7 @@
     <w:lsdException w:qFormat="1" w:unhideWhenUsed="0" w:uiPriority="0" w:semiHidden="0" w:name="Title"/>
     <w:lsdException w:unhideWhenUsed="0" w:uiPriority="0" w:semiHidden="0" w:name="Closing"/>
     <w:lsdException w:unhideWhenUsed="0" w:uiPriority="0" w:semiHidden="0" w:name="Signature"/>
-    <w:lsdException w:unhideWhenUsed="0" w:uiPriority="0" w:name="Default Paragraph Font"/>
+    <w:lsdException w:qFormat="1" w:unhideWhenUsed="0" w:uiPriority="0" w:name="Default Paragraph Font"/>
     <w:lsdException w:unhideWhenUsed="0" w:uiPriority="0" w:semiHidden="0" w:name="Body Text"/>
     <w:lsdException w:unhideWhenUsed="0" w:uiPriority="0" w:semiHidden="0" w:name="Body Text Indent"/>
     <w:lsdException w:unhideWhenUsed="0" w:uiPriority="0" w:semiHidden="0" w:name="List Continue"/>
@@ -4996,7 +7081,7 @@
     <w:lsdException w:unhideWhenUsed="0" w:uiPriority="0" w:semiHidden="0" w:name="HTML Sample"/>
     <w:lsdException w:unhideWhenUsed="0" w:uiPriority="0" w:semiHidden="0" w:name="HTML Typewriter"/>
     <w:lsdException w:unhideWhenUsed="0" w:uiPriority="0" w:semiHidden="0" w:name="HTML Variable"/>
-    <w:lsdException w:unhideWhenUsed="0" w:uiPriority="0" w:name="Normal Table"/>
+    <w:lsdException w:qFormat="1" w:unhideWhenUsed="0" w:uiPriority="0" w:name="Normal Table"/>
     <w:lsdException w:unhideWhenUsed="0" w:uiPriority="0" w:semiHidden="0" w:name="annotation subject"/>
     <w:lsdException w:unhideWhenUsed="0" w:uiPriority="0" w:semiHidden="0" w:name="Table Simple 1"/>
     <w:lsdException w:unhideWhenUsed="0" w:uiPriority="0" w:semiHidden="0" w:name="Table Simple 2"/>
@@ -5241,14 +7326,16 @@
       <w:szCs w:val="21"/>
     </w:rPr>
   </w:style>
-  <w:style w:type="character" w:default="1" w:styleId="12">
+  <w:style w:type="character" w:default="1" w:styleId="14">
     <w:name w:val="Default Paragraph Font"/>
     <w:semiHidden/>
+    <w:qFormat/>
     <w:uiPriority w:val="0"/>
   </w:style>
-  <w:style w:type="table" w:default="1" w:styleId="11">
+  <w:style w:type="table" w:default="1" w:styleId="13">
     <w:name w:val="Normal Table"/>
     <w:semiHidden/>
+    <w:qFormat/>
     <w:uiPriority w:val="0"/>
     <w:tblPr>
       <w:tblCellMar>
@@ -5261,7 +7348,7 @@
   </w:style>
   <w:style w:type="paragraph" w:styleId="8">
     <w:name w:val="endnote text"/>
-    <w:link w:val="18"/>
+    <w:link w:val="20"/>
     <w:semiHidden/>
     <w:unhideWhenUsed/>
     <w:qFormat/>
@@ -5276,8 +7363,14 @@
     </w:rPr>
   </w:style>
   <w:style w:type="paragraph" w:styleId="9">
+    <w:name w:val="toc 1"/>
+    <w:basedOn w:val="1"/>
+    <w:next w:val="1"/>
+    <w:uiPriority w:val="0"/>
+  </w:style>
+  <w:style w:type="paragraph" w:styleId="10">
     <w:name w:val="footnote text"/>
-    <w:link w:val="17"/>
+    <w:link w:val="19"/>
     <w:semiHidden/>
     <w:unhideWhenUsed/>
     <w:qFormat/>
@@ -5291,7 +7384,16 @@
       <w:szCs w:val="20"/>
     </w:rPr>
   </w:style>
-  <w:style w:type="paragraph" w:styleId="10">
+  <w:style w:type="paragraph" w:styleId="11">
+    <w:name w:val="toc 2"/>
+    <w:basedOn w:val="1"/>
+    <w:next w:val="1"/>
+    <w:uiPriority w:val="0"/>
+    <w:pPr>
+      <w:ind w:left="420" w:leftChars="200"/>
+    </w:pPr>
+  </w:style>
+  <w:style w:type="paragraph" w:styleId="12">
     <w:name w:val="Title"/>
     <w:qFormat/>
     <w:uiPriority w:val="0"/>
@@ -5301,7 +7403,7 @@
       <w:szCs w:val="56"/>
     </w:rPr>
   </w:style>
-  <w:style w:type="character" w:styleId="13">
+  <w:style w:type="character" w:styleId="15">
     <w:name w:val="endnote reference"/>
     <w:semiHidden/>
     <w:unhideWhenUsed/>
@@ -5311,7 +7413,7 @@
       <w:vertAlign w:val="superscript"/>
     </w:rPr>
   </w:style>
-  <w:style w:type="character" w:styleId="14">
+  <w:style w:type="character" w:styleId="16">
     <w:name w:val="Hyperlink"/>
     <w:unhideWhenUsed/>
     <w:qFormat/>
@@ -5321,7 +7423,7 @@
       <w:u w:val="single"/>
     </w:rPr>
   </w:style>
-  <w:style w:type="character" w:styleId="15">
+  <w:style w:type="character" w:styleId="17">
     <w:name w:val="footnote reference"/>
     <w:semiHidden/>
     <w:unhideWhenUsed/>
@@ -5331,7 +7433,7 @@
       <w:vertAlign w:val="superscript"/>
     </w:rPr>
   </w:style>
-  <w:style w:type="paragraph" w:styleId="16">
+  <w:style w:type="paragraph" w:styleId="18">
     <w:name w:val="List Paragraph"/>
     <w:qFormat/>
     <w:uiPriority w:val="0"/>
@@ -5341,9 +7443,9 @@
       <w:szCs w:val="21"/>
     </w:rPr>
   </w:style>
-  <w:style w:type="character" w:customStyle="1" w:styleId="17">
+  <w:style w:type="character" w:customStyle="1" w:styleId="19">
     <w:name w:val="Footnote Text Char"/>
-    <w:link w:val="9"/>
+    <w:link w:val="10"/>
     <w:semiHidden/>
     <w:unhideWhenUsed/>
     <w:qFormat/>
@@ -5353,7 +7455,7 @@
       <w:szCs w:val="20"/>
     </w:rPr>
   </w:style>
-  <w:style w:type="character" w:customStyle="1" w:styleId="18">
+  <w:style w:type="character" w:customStyle="1" w:styleId="20">
     <w:name w:val="Endnote Text Char"/>
     <w:link w:val="8"/>
     <w:semiHidden/>

</xml_diff>

<commit_message>
docs: fix 12 discrepancies in gen_report.js, add HostStatus table, fix CLAUDE.md
</commit_message>
<xml_diff>
--- a/课程设计报告.docx
+++ b/课程设计报告.docx
@@ -1427,7 +1427,7 @@
                 <w:sz w:val="21"/>
                 <w:szCs w:val="21"/>
               </w:rPr>
-              <w:t xml:space="preserve">argparse 子命令 scan/discover，参数 --target --ports --threads --timeout --output --format</w:t>
+              <w:t xml:space="preserve">argparse 子命令 scan/discover，scan 参数 --target/--ports，discover 参数 --network，共用 --threads/--timeout/--output/--format</w:t>
             </w:r>
           </w:p>
         </w:tc>
@@ -1708,7 +1708,7 @@
           <w:sz w:val="21"/>
           <w:szCs w:val="21"/>
         </w:rPr>
-        <w:t xml:space="preserve">用户输入 (CLI/GUI) → ScanConfig (targets, ports, timeout, max_workers) → TCPScanner / ICMPScanner → on_result 回调 → UI 实时更新表格 → 完成后 ReportGenerator → 导出 HTML/MD/JSON/CSV。</w:t>
+        <w:t xml:space="preserve">用户输入 (CLI/GUI) → ScanConfig (targets, ports, timeout, max_workers) → TCPScanner；用户输入 (CLI/GUI) → ICMPScanner(timeout, max_workers) → ICMP 主机发现 → on_result 回调 → UI 实时更新 → 完成后 ReportGenerator → 导出。</w:t>
       </w:r>
     </w:p>
     <w:p>
@@ -2205,6 +2205,383 @@
     </w:tbl>
     <w:p>
       <w:pPr>
+        <w:spacing w:after="60"/>
+      </w:pPr>
+    </w:p>
+    <w:p>
+      <w:pPr>
+        <w:spacing w:after="120" w:before="0"/>
+      </w:pPr>
+      <w:r>
+        <w:rPr>
+          <w:rFonts w:ascii="SimSun" w:cs="SimSun" w:eastAsia="SimSun" w:hAnsi="SimSun"/>
+          <w:sz w:val="21"/>
+          <w:szCs w:val="21"/>
+        </w:rPr>
+        <w:t xml:space="preserve">主机发现定义了三种主机状态枚举：</w:t>
+      </w:r>
+    </w:p>
+    <w:tbl>
+      <w:tblPr>
+        <w:tblW w:type="dxa" w:w="9360"/>
+        <w:tblBorders>
+          <w:top w:val="single" w:color="auto" w:sz="4"/>
+          <w:left w:val="single" w:color="auto" w:sz="4"/>
+          <w:bottom w:val="single" w:color="auto" w:sz="4"/>
+          <w:right w:val="single" w:color="auto" w:sz="4"/>
+          <w:insideH w:val="single" w:color="auto" w:sz="4"/>
+          <w:insideV w:val="single" w:color="auto" w:sz="4"/>
+        </w:tblBorders>
+      </w:tblPr>
+      <w:tblGrid>
+        <w:gridCol w:w="2000"/>
+        <w:gridCol w:w="1800"/>
+        <w:gridCol w:w="5560"/>
+      </w:tblGrid>
+      <w:tr>
+        <w:tc>
+          <w:tcPr>
+            <w:tcW w:type="dxa" w:w="2000"/>
+            <w:tcBorders>
+              <w:top w:val="single" w:color="999999" w:sz="1"/>
+              <w:left w:val="single" w:color="999999" w:sz="1"/>
+              <w:bottom w:val="single" w:color="999999" w:sz="1"/>
+              <w:right w:val="single" w:color="999999" w:sz="1"/>
+            </w:tcBorders>
+            <w:shd w:fill="D5E8F0" w:val="clear"/>
+            <w:tcMar>
+              <w:top w:type="dxa" w:w="80"/>
+              <w:left w:type="dxa" w:w="120"/>
+              <w:bottom w:type="dxa" w:w="80"/>
+              <w:right w:type="dxa" w:w="120"/>
+            </w:tcMar>
+          </w:tcPr>
+          <w:p>
+            <w:r>
+              <w:rPr>
+                <w:rFonts w:ascii="SimHei" w:cs="SimHei" w:eastAsia="SimHei" w:hAnsi="SimHei"/>
+                <w:b/>
+                <w:bCs/>
+                <w:sz w:val="22"/>
+                <w:szCs w:val="22"/>
+              </w:rPr>
+              <w:t xml:space="preserve">枚举值</w:t>
+            </w:r>
+          </w:p>
+        </w:tc>
+        <w:tc>
+          <w:tcPr>
+            <w:tcW w:type="dxa" w:w="1800"/>
+            <w:tcBorders>
+              <w:top w:val="single" w:color="999999" w:sz="1"/>
+              <w:left w:val="single" w:color="999999" w:sz="1"/>
+              <w:bottom w:val="single" w:color="999999" w:sz="1"/>
+              <w:right w:val="single" w:color="999999" w:sz="1"/>
+            </w:tcBorders>
+            <w:shd w:fill="D5E8F0" w:val="clear"/>
+            <w:tcMar>
+              <w:top w:type="dxa" w:w="80"/>
+              <w:left w:type="dxa" w:w="120"/>
+              <w:bottom w:type="dxa" w:w="80"/>
+              <w:right w:type="dxa" w:w="120"/>
+            </w:tcMar>
+          </w:tcPr>
+          <w:p>
+            <w:r>
+              <w:rPr>
+                <w:rFonts w:ascii="SimHei" w:cs="SimHei" w:eastAsia="SimHei" w:hAnsi="SimHei"/>
+                <w:b/>
+                <w:bCs/>
+                <w:sz w:val="22"/>
+                <w:szCs w:val="22"/>
+              </w:rPr>
+              <w:t xml:space="preserve">含义</w:t>
+            </w:r>
+          </w:p>
+        </w:tc>
+        <w:tc>
+          <w:tcPr>
+            <w:tcW w:type="dxa" w:w="5560"/>
+            <w:tcBorders>
+              <w:top w:val="single" w:color="999999" w:sz="1"/>
+              <w:left w:val="single" w:color="999999" w:sz="1"/>
+              <w:bottom w:val="single" w:color="999999" w:sz="1"/>
+              <w:right w:val="single" w:color="999999" w:sz="1"/>
+            </w:tcBorders>
+            <w:shd w:fill="D5E8F0" w:val="clear"/>
+            <w:tcMar>
+              <w:top w:type="dxa" w:w="80"/>
+              <w:left w:type="dxa" w:w="120"/>
+              <w:bottom w:type="dxa" w:w="80"/>
+              <w:right w:type="dxa" w:w="120"/>
+            </w:tcMar>
+          </w:tcPr>
+          <w:p>
+            <w:r>
+              <w:rPr>
+                <w:rFonts w:ascii="SimHei" w:cs="SimHei" w:eastAsia="SimHei" w:hAnsi="SimHei"/>
+                <w:b/>
+                <w:bCs/>
+                <w:sz w:val="22"/>
+                <w:szCs w:val="22"/>
+              </w:rPr>
+              <w:t xml:space="preserve">判定条件</w:t>
+            </w:r>
+          </w:p>
+        </w:tc>
+      </w:tr>
+      <w:tr>
+        <w:tc>
+          <w:tcPr>
+            <w:tcW w:type="dxa" w:w="2000"/>
+            <w:tcBorders>
+              <w:top w:val="single" w:color="999999" w:sz="1"/>
+              <w:left w:val="single" w:color="999999" w:sz="1"/>
+              <w:bottom w:val="single" w:color="999999" w:sz="1"/>
+              <w:right w:val="single" w:color="999999" w:sz="1"/>
+            </w:tcBorders>
+            <w:tcMar>
+              <w:top w:type="dxa" w:w="80"/>
+              <w:left w:type="dxa" w:w="120"/>
+              <w:bottom w:type="dxa" w:w="80"/>
+              <w:right w:type="dxa" w:w="120"/>
+            </w:tcMar>
+          </w:tcPr>
+          <w:p>
+            <w:r>
+              <w:rPr>
+                <w:rFonts w:ascii="Consolas" w:cs="Consolas" w:eastAsia="Consolas" w:hAnsi="Consolas"/>
+                <w:sz w:val="18"/>
+                <w:szCs w:val="18"/>
+              </w:rPr>
+              <w:t xml:space="preserve">HostStatus.UP</w:t>
+            </w:r>
+          </w:p>
+        </w:tc>
+        <w:tc>
+          <w:tcPr>
+            <w:tcW w:type="dxa" w:w="1800"/>
+            <w:tcBorders>
+              <w:top w:val="single" w:color="999999" w:sz="1"/>
+              <w:left w:val="single" w:color="999999" w:sz="1"/>
+              <w:bottom w:val="single" w:color="999999" w:sz="1"/>
+              <w:right w:val="single" w:color="999999" w:sz="1"/>
+            </w:tcBorders>
+            <w:tcMar>
+              <w:top w:type="dxa" w:w="80"/>
+              <w:left w:type="dxa" w:w="120"/>
+              <w:bottom w:type="dxa" w:w="80"/>
+              <w:right w:type="dxa" w:w="120"/>
+            </w:tcMar>
+          </w:tcPr>
+          <w:p>
+            <w:r>
+              <w:rPr>
+                <w:rFonts w:ascii="SimSun" w:cs="SimSun" w:eastAsia="SimSun" w:hAnsi="SimSun"/>
+                <w:sz w:val="21"/>
+                <w:szCs w:val="21"/>
+              </w:rPr>
+              <w:t xml:space="preserve">主机在线</w:t>
+            </w:r>
+          </w:p>
+        </w:tc>
+        <w:tc>
+          <w:tcPr>
+            <w:tcW w:type="dxa" w:w="5560"/>
+            <w:tcBorders>
+              <w:top w:val="single" w:color="999999" w:sz="1"/>
+              <w:left w:val="single" w:color="999999" w:sz="1"/>
+              <w:bottom w:val="single" w:color="999999" w:sz="1"/>
+              <w:right w:val="single" w:color="999999" w:sz="1"/>
+            </w:tcBorders>
+            <w:tcMar>
+              <w:top w:type="dxa" w:w="80"/>
+              <w:left w:type="dxa" w:w="120"/>
+              <w:bottom w:type="dxa" w:w="80"/>
+              <w:right w:type="dxa" w:w="120"/>
+            </w:tcMar>
+          </w:tcPr>
+          <w:p>
+            <w:r>
+              <w:rPr>
+                <w:rFonts w:ascii="SimSun" w:cs="SimSun" w:eastAsia="SimSun" w:hAnsi="SimSun"/>
+                <w:sz w:val="21"/>
+                <w:szCs w:val="21"/>
+              </w:rPr>
+              <w:t xml:space="preserve">ping returncode == 0（收到 Echo Reply）</w:t>
+            </w:r>
+          </w:p>
+        </w:tc>
+      </w:tr>
+      <w:tr>
+        <w:tc>
+          <w:tcPr>
+            <w:tcW w:type="dxa" w:w="2000"/>
+            <w:tcBorders>
+              <w:top w:val="single" w:color="999999" w:sz="1"/>
+              <w:left w:val="single" w:color="999999" w:sz="1"/>
+              <w:bottom w:val="single" w:color="999999" w:sz="1"/>
+              <w:right w:val="single" w:color="999999" w:sz="1"/>
+            </w:tcBorders>
+            <w:tcMar>
+              <w:top w:type="dxa" w:w="80"/>
+              <w:left w:type="dxa" w:w="120"/>
+              <w:bottom w:type="dxa" w:w="80"/>
+              <w:right w:type="dxa" w:w="120"/>
+            </w:tcMar>
+          </w:tcPr>
+          <w:p>
+            <w:r>
+              <w:rPr>
+                <w:rFonts w:ascii="Consolas" w:cs="Consolas" w:eastAsia="Consolas" w:hAnsi="Consolas"/>
+                <w:sz w:val="18"/>
+                <w:szCs w:val="18"/>
+              </w:rPr>
+              <w:t xml:space="preserve">HostStatus.DOWN</w:t>
+            </w:r>
+          </w:p>
+        </w:tc>
+        <w:tc>
+          <w:tcPr>
+            <w:tcW w:type="dxa" w:w="1800"/>
+            <w:tcBorders>
+              <w:top w:val="single" w:color="999999" w:sz="1"/>
+              <w:left w:val="single" w:color="999999" w:sz="1"/>
+              <w:bottom w:val="single" w:color="999999" w:sz="1"/>
+              <w:right w:val="single" w:color="999999" w:sz="1"/>
+            </w:tcBorders>
+            <w:tcMar>
+              <w:top w:type="dxa" w:w="80"/>
+              <w:left w:type="dxa" w:w="120"/>
+              <w:bottom w:type="dxa" w:w="80"/>
+              <w:right w:type="dxa" w:w="120"/>
+            </w:tcMar>
+          </w:tcPr>
+          <w:p>
+            <w:r>
+              <w:rPr>
+                <w:rFonts w:ascii="SimSun" w:cs="SimSun" w:eastAsia="SimSun" w:hAnsi="SimSun"/>
+                <w:sz w:val="21"/>
+                <w:szCs w:val="21"/>
+              </w:rPr>
+              <w:t xml:space="preserve">主机离线</w:t>
+            </w:r>
+          </w:p>
+        </w:tc>
+        <w:tc>
+          <w:tcPr>
+            <w:tcW w:type="dxa" w:w="5560"/>
+            <w:tcBorders>
+              <w:top w:val="single" w:color="999999" w:sz="1"/>
+              <w:left w:val="single" w:color="999999" w:sz="1"/>
+              <w:bottom w:val="single" w:color="999999" w:sz="1"/>
+              <w:right w:val="single" w:color="999999" w:sz="1"/>
+            </w:tcBorders>
+            <w:tcMar>
+              <w:top w:type="dxa" w:w="80"/>
+              <w:left w:type="dxa" w:w="120"/>
+              <w:bottom w:type="dxa" w:w="80"/>
+              <w:right w:type="dxa" w:w="120"/>
+            </w:tcMar>
+          </w:tcPr>
+          <w:p>
+            <w:r>
+              <w:rPr>
+                <w:rFonts w:ascii="SimSun" w:cs="SimSun" w:eastAsia="SimSun" w:hAnsi="SimSun"/>
+                <w:sz w:val="21"/>
+                <w:szCs w:val="21"/>
+              </w:rPr>
+              <w:t xml:space="preserve">ping returncode != 0 或 subprocess.TimeoutExpired</w:t>
+            </w:r>
+          </w:p>
+        </w:tc>
+      </w:tr>
+      <w:tr>
+        <w:tc>
+          <w:tcPr>
+            <w:tcW w:type="dxa" w:w="2000"/>
+            <w:tcBorders>
+              <w:top w:val="single" w:color="999999" w:sz="1"/>
+              <w:left w:val="single" w:color="999999" w:sz="1"/>
+              <w:bottom w:val="single" w:color="999999" w:sz="1"/>
+              <w:right w:val="single" w:color="999999" w:sz="1"/>
+            </w:tcBorders>
+            <w:tcMar>
+              <w:top w:type="dxa" w:w="80"/>
+              <w:left w:type="dxa" w:w="120"/>
+              <w:bottom w:type="dxa" w:w="80"/>
+              <w:right w:type="dxa" w:w="120"/>
+            </w:tcMar>
+          </w:tcPr>
+          <w:p>
+            <w:r>
+              <w:rPr>
+                <w:rFonts w:ascii="Consolas" w:cs="Consolas" w:eastAsia="Consolas" w:hAnsi="Consolas"/>
+                <w:sz w:val="18"/>
+                <w:szCs w:val="18"/>
+              </w:rPr>
+              <w:t xml:space="preserve">HostStatus.UNKNOWN</w:t>
+            </w:r>
+          </w:p>
+        </w:tc>
+        <w:tc>
+          <w:tcPr>
+            <w:tcW w:type="dxa" w:w="1800"/>
+            <w:tcBorders>
+              <w:top w:val="single" w:color="999999" w:sz="1"/>
+              <w:left w:val="single" w:color="999999" w:sz="1"/>
+              <w:bottom w:val="single" w:color="999999" w:sz="1"/>
+              <w:right w:val="single" w:color="999999" w:sz="1"/>
+            </w:tcBorders>
+            <w:tcMar>
+              <w:top w:type="dxa" w:w="80"/>
+              <w:left w:type="dxa" w:w="120"/>
+              <w:bottom w:type="dxa" w:w="80"/>
+              <w:right w:type="dxa" w:w="120"/>
+            </w:tcMar>
+          </w:tcPr>
+          <w:p>
+            <w:r>
+              <w:rPr>
+                <w:rFonts w:ascii="SimSun" w:cs="SimSun" w:eastAsia="SimSun" w:hAnsi="SimSun"/>
+                <w:sz w:val="21"/>
+                <w:szCs w:val="21"/>
+              </w:rPr>
+              <w:t xml:space="preserve">状态未知</w:t>
+            </w:r>
+          </w:p>
+        </w:tc>
+        <w:tc>
+          <w:tcPr>
+            <w:tcW w:type="dxa" w:w="5560"/>
+            <w:tcBorders>
+              <w:top w:val="single" w:color="999999" w:sz="1"/>
+              <w:left w:val="single" w:color="999999" w:sz="1"/>
+              <w:bottom w:val="single" w:color="999999" w:sz="1"/>
+              <w:right w:val="single" w:color="999999" w:sz="1"/>
+            </w:tcBorders>
+            <w:tcMar>
+              <w:top w:type="dxa" w:w="80"/>
+              <w:left w:type="dxa" w:w="120"/>
+              <w:bottom w:type="dxa" w:w="80"/>
+              <w:right w:type="dxa" w:w="120"/>
+            </w:tcMar>
+          </w:tcPr>
+          <w:p>
+            <w:r>
+              <w:rPr>
+                <w:rFonts w:ascii="SimSun" w:cs="SimSun" w:eastAsia="SimSun" w:hAnsi="SimSun"/>
+                <w:sz w:val="21"/>
+                <w:szCs w:val="21"/>
+              </w:rPr>
+              <w:t xml:space="preserve">ping 命令不存在 (FileNotFoundError) 等异常</w:t>
+            </w:r>
+          </w:p>
+        </w:tc>
+      </w:tr>
+    </w:tbl>
+    <w:p>
+      <w:pPr>
         <w:pStyle w:val="Heading2"/>
         <w:spacing w:after="180" w:before="240"/>
       </w:pPr>
@@ -2642,43 +3019,43 @@
           <w:sz w:val="21"/>
           <w:szCs w:val="21"/>
         </w:rPr>
-        <w:t xml:space="preserve">知名系统端口（0-1023）：HTTP(80)、HTTPS(443)、SSH(22)、FTP(21)、SMTP(25)、DNS(53)、TELNET(23) 等 100+ 个。</w:t>
-      </w:r>
-    </w:p>
-    <w:p>
-      <w:pPr>
-        <w:pStyle w:val="ListParagraph"/>
-        <w:numPr>
-          <w:ilvl w:val="0"/>
-          <w:numId w:val="2"/>
-        </w:numPr>
-        <w:spacing w:after="60"/>
-      </w:pPr>
-      <w:r>
-        <w:rPr>
-          <w:rFonts w:ascii="SimSun" w:cs="SimSun" w:eastAsia="SimSun" w:hAnsi="SimSun"/>
-          <w:sz w:val="21"/>
-          <w:szCs w:val="21"/>
-        </w:rPr>
-        <w:t xml:space="preserve">注册端口（1024-49151）：MySQL(3306)、PostgreSQL(5432)、Redis(6379)、MongoDB(27017)、RDP(3389)、Docker(2375/2376) 等 150+ 个。</w:t>
-      </w:r>
-    </w:p>
-    <w:p>
-      <w:pPr>
-        <w:pStyle w:val="ListParagraph"/>
-        <w:numPr>
-          <w:ilvl w:val="0"/>
-          <w:numId w:val="2"/>
-        </w:numPr>
-        <w:spacing w:after="60"/>
-      </w:pPr>
-      <w:r>
-        <w:rPr>
-          <w:rFonts w:ascii="SimSun" w:cs="SimSun" w:eastAsia="SimSun" w:hAnsi="SimSun"/>
-          <w:sz w:val="21"/>
-          <w:szCs w:val="21"/>
-        </w:rPr>
-        <w:t xml:space="preserve">常见高端口：Splunk(9997)、Webmin(10000)、Memcached(11211)、Minecraft(25565) 等 50+ 个。</w:t>
+        <w:t xml:space="preserve">知名系统端口（1-1023）：全部 1023 个端口全覆盖，包括 HTTP(80)、HTTPS(443)、SSH(22)、FTP(21)、SMTP(25)、DNS(53)、TELNET(23) 等。</w:t>
+      </w:r>
+    </w:p>
+    <w:p>
+      <w:pPr>
+        <w:pStyle w:val="ListParagraph"/>
+        <w:numPr>
+          <w:ilvl w:val="0"/>
+          <w:numId w:val="2"/>
+        </w:numPr>
+        <w:spacing w:after="60"/>
+      </w:pPr>
+      <w:r>
+        <w:rPr>
+          <w:rFonts w:ascii="SimSun" w:cs="SimSun" w:eastAsia="SimSun" w:hAnsi="SimSun"/>
+          <w:sz w:val="21"/>
+          <w:szCs w:val="21"/>
+        </w:rPr>
+        <w:t xml:space="preserve">注册端口（1024-49151）：MySQL(3306)、PostgreSQL(5432)、Redis(6379)、MongoDB(27017)、RDP(3389)、Docker(2375/2376) 等约 150 个。</w:t>
+      </w:r>
+    </w:p>
+    <w:p>
+      <w:pPr>
+        <w:pStyle w:val="ListParagraph"/>
+        <w:numPr>
+          <w:ilvl w:val="0"/>
+          <w:numId w:val="2"/>
+        </w:numPr>
+        <w:spacing w:after="60"/>
+      </w:pPr>
+      <w:r>
+        <w:rPr>
+          <w:rFonts w:ascii="SimSun" w:cs="SimSun" w:eastAsia="SimSun" w:hAnsi="SimSun"/>
+          <w:sz w:val="21"/>
+          <w:szCs w:val="21"/>
+        </w:rPr>
+        <w:t xml:space="preserve">常见高端口：Splunk(9997)、Webmin(10000)、Memcached(11211)、Minecraft(25565) 等约 34 个。</w:t>
       </w:r>
     </w:p>
     <w:p>
@@ -2921,7 +3298,7 @@
           <w:sz w:val="21"/>
           <w:szCs w:val="21"/>
         </w:rPr>
-        <w:t xml:space="preserve">启动方式：双击 gui.pyw（Windows 关联 pythonw.exe，无命令行窗口），唯一启动方式。</w:t>
+        <w:t xml:space="preserve">启动方式：双击 gui.pyw（Windows 关联 pythonw.exe，无命令行窗口），也可 python gui.py 调试运行。</w:t>
       </w:r>
     </w:p>
     <w:p>
@@ -3337,7 +3714,7 @@
           <w:sz w:val="21"/>
           <w:szCs w:val="21"/>
         </w:rPr>
-        <w:t xml:space="preserve">服务名查询：已知端口 (80→http, 443→https, 22→ssh) / 未知端口 (65000→unknown)</w:t>
+        <w:t xml:space="preserve">服务名查询：已知端口 (80→http, 443→https, 22→ssh) / 未知端口 (1024→unknown)</w:t>
       </w:r>
     </w:p>
     <w:p>
@@ -3510,7 +3887,7 @@
           <w:sz w:val="21"/>
           <w:szCs w:val="21"/>
         </w:rPr>
-        <w:t xml:space="preserve">CLI 发现主机：python cli.py discover --target 127.0.0.1 → 检测到存活主机 1 台</w:t>
+        <w:t xml:space="preserve">CLI 发现主机：python cli.py discover --network 127.0.0.1 → 检测到存活主机 1 台</w:t>
       </w:r>
     </w:p>
     <w:p>
@@ -4280,7 +4657,7 @@
           <w:sz w:val="20"/>
           <w:szCs w:val="20"/>
         </w:rPr>
-        <w:t xml:space="preserve">（dataclass）：host: str, status: HostStatus, open_ports: list[ScanResult], scan_time: float, error_message: str</w:t>
+        <w:t xml:space="preserve">（dataclass）：host: str, status: HostStatus, open_ports: list[ScanResult] = [], scan_time: float = 0.0, error_message: str = ""</w:t>
       </w:r>
     </w:p>
     <w:p>
@@ -4303,7 +4680,7 @@
           <w:sz w:val="20"/>
           <w:szCs w:val="20"/>
         </w:rPr>
-        <w:t xml:space="preserve">（dataclass）：targets: list[str], ports: list[int], timeout: float = 1.0, max_workers: int = 100</w:t>
+        <w:t xml:space="preserve">（dataclass）：targets: list[str] = [], ports: list[int] = [], timeout: float = 1.0, max_workers: int = 100</w:t>
       </w:r>
     </w:p>
     <w:p>
@@ -5435,7 +5812,7 @@
           <w:sz w:val="21"/>
           <w:szCs w:val="21"/>
         </w:rPr>
-        <w:t xml:space="preserve">ThreadPoolExecutor 的 max_workers 通过 ScanConfig 控制，取 min(用户设置, 端口数, 500)。</w:t>
+        <w:t xml:space="preserve">ThreadPoolExecutor 的 max_workers：TCP 取 min(用户设置, 端口数, 500)，ICMP 取 min(用户设置, 主机数, 100)。</w:t>
       </w:r>
     </w:p>
     <w:p>

</xml_diff>